<commit_message>
feat: Update AFH AI Platform Architecture Proposal documents
</commit_message>
<xml_diff>
--- a/docs/AFH_AI_Platform_Architecture_Proposal.docx
+++ b/docs/AFH_AI_Platform_Architecture_Proposal.docx
@@ -12,7 +12,7 @@
           <w:color w:val="2E74B5"/>
           <w:sz w:val="21"/>
         </w:rPr>
-        <w:t>ARCHITECTURE DECISION PROPOSAL</w:t>
+        <w:t>ARCHITECTURE PROPOSAL</w:t>
       </w:r>
     </w:p>
     <w:p>
@@ -241,7 +241,7 @@
                 <w:b w:val="0"/>
                 <w:sz w:val="17"/>
               </w:rPr>
-              <w:t>Decision</w:t>
+              <w:t>Proposal</w:t>
             </w:r>
           </w:p>
         </w:tc>
@@ -267,7 +267,7 @@
                 <w:b w:val="0"/>
                 <w:sz w:val="17"/>
               </w:rPr>
-              <w:t>Adopt a central MCP Gateway with service-owned tool providers, evolving toward workflow-specific services</w:t>
+              <w:t>Introduce a central MCP Gateway with service-owned tool providers, evolving toward workflow-specific services</w:t>
             </w:r>
           </w:p>
         </w:tc>
@@ -365,7 +365,7 @@
                 <w:color w:val="1F4D78"/>
                 <w:sz w:val="21"/>
               </w:rPr>
-              <w:t>Recommendation</w:t>
+              <w:t>Proposed approach</w:t>
             </w:r>
             <w:r>
               <w:br/>
@@ -396,7 +396,7 @@
     </w:p>
     <w:p>
       <w:r>
-        <w:t>AFH should introduce AI capabilities through a governed MCP Gateway rather than asking every AI client to connect to every microservice directly. The gateway should be treated as a protocol and policy boundary, not a new home for domain logic.</w:t>
+        <w:t>This proposal recommends introducing AI capabilities through a governed MCP Gateway rather than asking every AI client to connect to every microservice directly. The gateway is positioned as a protocol and policy boundary, not a new home for domain logic.</w:t>
       </w:r>
     </w:p>
     <w:p>
@@ -410,7 +410,7 @@
         <w:spacing w:after="80"/>
       </w:pPr>
       <w:r>
-        <w:t>Use the MCP Gateway as the single AI entry point for Codex, GitHub Copilot, ChatGPT, Claude, and future internal agents.</w:t>
+        <w:t>Position the MCP Gateway as the single AI entry point for Codex, GitHub Copilot, ChatGPT, Claude, and future internal agents.</w:t>
       </w:r>
     </w:p>
     <w:p>
@@ -428,7 +428,16 @@
         <w:spacing w:after="80"/>
       </w:pPr>
       <w:r>
-        <w:t>Use shared SDKs for tool contracts, actor context, redaction, audit envelopes, MCP protocol helpers, and external client primitives.</w:t>
+        <w:t>Extend shared SDKs for AI/MCP contracts, actor context, redaction, audit envelopes, and protocol helpers.</w:t>
+      </w:r>
+    </w:p>
+    <w:p>
+      <w:pPr>
+        <w:pStyle w:val="ListBullet"/>
+        <w:spacing w:after="80"/>
+      </w:pPr>
+      <w:r>
+        <w:t>Introduce DevOps Integration as a service/function app because Azure DevOps secrets, managed identity, audit policy, and workflow state need a runtime boundary.</w:t>
       </w:r>
     </w:p>
     <w:p>
@@ -1399,6 +1408,1004 @@
     </w:p>
     <w:p>
       <w:pPr>
+        <w:pStyle w:val="Heading2"/>
+      </w:pPr>
+      <w:r>
+        <w:t>2.1 Existing services and proposed implementation</w:t>
+      </w:r>
+    </w:p>
+    <w:p>
+      <w:r>
+        <w:t>The proposal separates what already exists from what would be added. Existing business services remain the system of record; new AI-facing components provide protocol, discovery, and integration boundaries.</w:t>
+      </w:r>
+    </w:p>
+    <w:tbl>
+      <w:tblPr>
+        <w:tblStyle w:val="TableGrid"/>
+        <w:tblW w:type="auto" w:w="0"/>
+        <w:jc w:val="center"/>
+        <w:tblLayout w:type="fixed"/>
+        <w:tblLook w:firstColumn="1" w:firstRow="1" w:lastColumn="0" w:lastRow="0" w:noHBand="0" w:noVBand="1" w:val="04A0"/>
+      </w:tblPr>
+      <w:tblGrid>
+        <w:gridCol w:w="3120"/>
+        <w:gridCol w:w="3120"/>
+        <w:gridCol w:w="3120"/>
+      </w:tblGrid>
+      <w:tr>
+        <w:tc>
+          <w:tcPr>
+            <w:tcW w:type="dxa" w:w="1944"/>
+            <w:shd w:fill="E8EEF5"/>
+            <w:vAlign w:val="center"/>
+            <w:tcMar>
+              <w:top w:w="100" w:type="dxa"/>
+              <w:bottom w:w="100" w:type="dxa"/>
+              <w:start w:w="100" w:type="dxa"/>
+              <w:end w:w="100" w:type="dxa"/>
+            </w:tcMar>
+          </w:tcPr>
+          <w:p>
+            <w:pPr>
+              <w:spacing w:after="0"/>
+            </w:pPr>
+            <w:r/>
+            <w:r>
+              <w:rPr>
+                <w:rFonts w:ascii="Calibri" w:hAnsi="Calibri"/>
+                <w:b/>
+                <w:color w:val="12202F"/>
+                <w:sz w:val="18"/>
+              </w:rPr>
+              <w:t>Area</w:t>
+            </w:r>
+          </w:p>
+        </w:tc>
+        <w:tc>
+          <w:tcPr>
+            <w:tcW w:type="dxa" w:w="3671"/>
+            <w:shd w:fill="E8EEF5"/>
+            <w:vAlign w:val="center"/>
+            <w:tcMar>
+              <w:top w:w="100" w:type="dxa"/>
+              <w:bottom w:w="100" w:type="dxa"/>
+              <w:start w:w="100" w:type="dxa"/>
+              <w:end w:w="100" w:type="dxa"/>
+            </w:tcMar>
+          </w:tcPr>
+          <w:p>
+            <w:pPr>
+              <w:spacing w:after="0"/>
+            </w:pPr>
+            <w:r/>
+            <w:r>
+              <w:rPr>
+                <w:rFonts w:ascii="Calibri" w:hAnsi="Calibri"/>
+                <w:b/>
+                <w:color w:val="12202F"/>
+                <w:sz w:val="18"/>
+              </w:rPr>
+              <w:t>Exists today</w:t>
+            </w:r>
+          </w:p>
+        </w:tc>
+        <w:tc>
+          <w:tcPr>
+            <w:tcW w:type="dxa" w:w="3600"/>
+            <w:shd w:fill="E8EEF5"/>
+            <w:vAlign w:val="center"/>
+            <w:tcMar>
+              <w:top w:w="100" w:type="dxa"/>
+              <w:bottom w:w="100" w:type="dxa"/>
+              <w:start w:w="100" w:type="dxa"/>
+              <w:end w:w="100" w:type="dxa"/>
+            </w:tcMar>
+          </w:tcPr>
+          <w:p>
+            <w:pPr>
+              <w:spacing w:after="0"/>
+            </w:pPr>
+            <w:r/>
+            <w:r>
+              <w:rPr>
+                <w:rFonts w:ascii="Calibri" w:hAnsi="Calibri"/>
+                <w:b/>
+                <w:color w:val="12202F"/>
+                <w:sz w:val="18"/>
+              </w:rPr>
+              <w:t>Proposed implementation</w:t>
+            </w:r>
+          </w:p>
+        </w:tc>
+      </w:tr>
+      <w:tr>
+        <w:tc>
+          <w:tcPr>
+            <w:tcW w:type="dxa" w:w="1944"/>
+            <w:vAlign w:val="center"/>
+            <w:tcMar>
+              <w:top w:w="100" w:type="dxa"/>
+              <w:bottom w:w="100" w:type="dxa"/>
+              <w:start w:w="100" w:type="dxa"/>
+              <w:end w:w="100" w:type="dxa"/>
+            </w:tcMar>
+          </w:tcPr>
+          <w:p>
+            <w:pPr>
+              <w:spacing w:after="0"/>
+            </w:pPr>
+            <w:r/>
+            <w:r>
+              <w:rPr>
+                <w:rFonts w:ascii="Calibri" w:hAnsi="Calibri"/>
+                <w:b w:val="0"/>
+                <w:sz w:val="17"/>
+              </w:rPr>
+              <w:t>Booking</w:t>
+            </w:r>
+          </w:p>
+        </w:tc>
+        <w:tc>
+          <w:tcPr>
+            <w:tcW w:type="dxa" w:w="3671"/>
+            <w:vAlign w:val="center"/>
+            <w:tcMar>
+              <w:top w:w="100" w:type="dxa"/>
+              <w:bottom w:w="100" w:type="dxa"/>
+              <w:start w:w="100" w:type="dxa"/>
+              <w:end w:w="100" w:type="dxa"/>
+            </w:tcMar>
+          </w:tcPr>
+          <w:p>
+            <w:pPr>
+              <w:spacing w:after="0"/>
+            </w:pPr>
+            <w:r/>
+            <w:r>
+              <w:rPr>
+                <w:rFonts w:ascii="Calibri" w:hAnsi="Calibri"/>
+                <w:b w:val="0"/>
+                <w:sz w:val="17"/>
+              </w:rPr>
+              <w:t>afh-booking-function-app with booking, availability, lifecycle, approval, reporting, and config APIs.</w:t>
+            </w:r>
+          </w:p>
+        </w:tc>
+        <w:tc>
+          <w:tcPr>
+            <w:tcW w:type="dxa" w:w="3600"/>
+            <w:vAlign w:val="center"/>
+            <w:tcMar>
+              <w:top w:w="100" w:type="dxa"/>
+              <w:bottom w:w="100" w:type="dxa"/>
+              <w:start w:w="100" w:type="dxa"/>
+              <w:end w:w="100" w:type="dxa"/>
+            </w:tcMar>
+          </w:tcPr>
+          <w:p>
+            <w:pPr>
+              <w:spacing w:after="0"/>
+            </w:pPr>
+            <w:r/>
+            <w:r>
+              <w:rPr>
+                <w:rFonts w:ascii="Calibri" w:hAnsi="Calibri"/>
+                <w:b w:val="0"/>
+                <w:sz w:val="17"/>
+              </w:rPr>
+              <w:t>Expose booking.* tools through a Booking tool manifest that maps to existing Booking HTTP APIs.</w:t>
+            </w:r>
+          </w:p>
+        </w:tc>
+      </w:tr>
+      <w:tr>
+        <w:tc>
+          <w:tcPr>
+            <w:tcW w:type="dxa" w:w="1944"/>
+            <w:vAlign w:val="center"/>
+            <w:tcMar>
+              <w:top w:w="100" w:type="dxa"/>
+              <w:bottom w:w="100" w:type="dxa"/>
+              <w:start w:w="100" w:type="dxa"/>
+              <w:end w:w="100" w:type="dxa"/>
+            </w:tcMar>
+          </w:tcPr>
+          <w:p>
+            <w:pPr>
+              <w:spacing w:after="0"/>
+            </w:pPr>
+            <w:r/>
+            <w:r>
+              <w:rPr>
+                <w:rFonts w:ascii="Calibri" w:hAnsi="Calibri"/>
+                <w:b w:val="0"/>
+                <w:sz w:val="17"/>
+              </w:rPr>
+              <w:t>Calendar</w:t>
+            </w:r>
+          </w:p>
+        </w:tc>
+        <w:tc>
+          <w:tcPr>
+            <w:tcW w:type="dxa" w:w="3671"/>
+            <w:vAlign w:val="center"/>
+            <w:tcMar>
+              <w:top w:w="100" w:type="dxa"/>
+              <w:bottom w:w="100" w:type="dxa"/>
+              <w:start w:w="100" w:type="dxa"/>
+              <w:end w:w="100" w:type="dxa"/>
+            </w:tcMar>
+          </w:tcPr>
+          <w:p>
+            <w:pPr>
+              <w:spacing w:after="0"/>
+            </w:pPr>
+            <w:r/>
+            <w:r>
+              <w:rPr>
+                <w:rFonts w:ascii="Calibri" w:hAnsi="Calibri"/>
+                <w:b w:val="0"/>
+                <w:sz w:val="17"/>
+              </w:rPr>
+              <w:t>afh-calendar-function-app with Graph schedule, appointment, webhook, subscription, and projection APIs.</w:t>
+            </w:r>
+          </w:p>
+        </w:tc>
+        <w:tc>
+          <w:tcPr>
+            <w:tcW w:type="dxa" w:w="3600"/>
+            <w:vAlign w:val="center"/>
+            <w:tcMar>
+              <w:top w:w="100" w:type="dxa"/>
+              <w:bottom w:w="100" w:type="dxa"/>
+              <w:start w:w="100" w:type="dxa"/>
+              <w:end w:w="100" w:type="dxa"/>
+            </w:tcMar>
+          </w:tcPr>
+          <w:p>
+            <w:pPr>
+              <w:spacing w:after="0"/>
+            </w:pPr>
+            <w:r/>
+            <w:r>
+              <w:rPr>
+                <w:rFonts w:ascii="Calibri" w:hAnsi="Calibri"/>
+                <w:b w:val="0"/>
+                <w:sz w:val="17"/>
+              </w:rPr>
+              <w:t>Expose calendar.* tools for schedule lookup, appointment inspection, and subscription operational queries.</w:t>
+            </w:r>
+          </w:p>
+        </w:tc>
+      </w:tr>
+      <w:tr>
+        <w:tc>
+          <w:tcPr>
+            <w:tcW w:type="dxa" w:w="1944"/>
+            <w:vAlign w:val="center"/>
+            <w:tcMar>
+              <w:top w:w="100" w:type="dxa"/>
+              <w:bottom w:w="100" w:type="dxa"/>
+              <w:start w:w="100" w:type="dxa"/>
+              <w:end w:w="100" w:type="dxa"/>
+            </w:tcMar>
+          </w:tcPr>
+          <w:p>
+            <w:pPr>
+              <w:spacing w:after="0"/>
+            </w:pPr>
+            <w:r/>
+            <w:r>
+              <w:rPr>
+                <w:rFonts w:ascii="Calibri" w:hAnsi="Calibri"/>
+                <w:b w:val="0"/>
+                <w:sz w:val="17"/>
+              </w:rPr>
+              <w:t>Notification</w:t>
+            </w:r>
+          </w:p>
+        </w:tc>
+        <w:tc>
+          <w:tcPr>
+            <w:tcW w:type="dxa" w:w="3671"/>
+            <w:vAlign w:val="center"/>
+            <w:tcMar>
+              <w:top w:w="100" w:type="dxa"/>
+              <w:bottom w:w="100" w:type="dxa"/>
+              <w:start w:w="100" w:type="dxa"/>
+              <w:end w:w="100" w:type="dxa"/>
+            </w:tcMar>
+          </w:tcPr>
+          <w:p>
+            <w:pPr>
+              <w:spacing w:after="0"/>
+            </w:pPr>
+            <w:r/>
+            <w:r>
+              <w:rPr>
+                <w:rFonts w:ascii="Calibri" w:hAnsi="Calibri"/>
+                <w:b w:val="0"/>
+                <w:sz w:val="17"/>
+              </w:rPr>
+              <w:t>afh-notification-function-app with notification requests, templates, settings, dispatch logs, bouncebacks, and retry operations.</w:t>
+            </w:r>
+          </w:p>
+        </w:tc>
+        <w:tc>
+          <w:tcPr>
+            <w:tcW w:type="dxa" w:w="3600"/>
+            <w:vAlign w:val="center"/>
+            <w:tcMar>
+              <w:top w:w="100" w:type="dxa"/>
+              <w:bottom w:w="100" w:type="dxa"/>
+              <w:start w:w="100" w:type="dxa"/>
+              <w:end w:w="100" w:type="dxa"/>
+            </w:tcMar>
+          </w:tcPr>
+          <w:p>
+            <w:pPr>
+              <w:spacing w:after="0"/>
+            </w:pPr>
+            <w:r/>
+            <w:r>
+              <w:rPr>
+                <w:rFonts w:ascii="Calibri" w:hAnsi="Calibri"/>
+                <w:b w:val="0"/>
+                <w:sz w:val="17"/>
+              </w:rPr>
+              <w:t>Expose notification.* tools for read-only status/templates first; mutating requeue/dead-letter tools later with approval.</w:t>
+            </w:r>
+          </w:p>
+        </w:tc>
+      </w:tr>
+      <w:tr>
+        <w:tc>
+          <w:tcPr>
+            <w:tcW w:type="dxa" w:w="1944"/>
+            <w:vAlign w:val="center"/>
+            <w:tcMar>
+              <w:top w:w="100" w:type="dxa"/>
+              <w:bottom w:w="100" w:type="dxa"/>
+              <w:start w:w="100" w:type="dxa"/>
+              <w:end w:w="100" w:type="dxa"/>
+            </w:tcMar>
+          </w:tcPr>
+          <w:p>
+            <w:pPr>
+              <w:spacing w:after="0"/>
+            </w:pPr>
+            <w:r/>
+            <w:r>
+              <w:rPr>
+                <w:rFonts w:ascii="Calibri" w:hAnsi="Calibri"/>
+                <w:b w:val="0"/>
+                <w:sz w:val="17"/>
+              </w:rPr>
+              <w:t>Location</w:t>
+            </w:r>
+          </w:p>
+        </w:tc>
+        <w:tc>
+          <w:tcPr>
+            <w:tcW w:type="dxa" w:w="3671"/>
+            <w:vAlign w:val="center"/>
+            <w:tcMar>
+              <w:top w:w="100" w:type="dxa"/>
+              <w:bottom w:w="100" w:type="dxa"/>
+              <w:start w:w="100" w:type="dxa"/>
+              <w:end w:w="100" w:type="dxa"/>
+            </w:tcMar>
+          </w:tcPr>
+          <w:p>
+            <w:pPr>
+              <w:spacing w:after="0"/>
+            </w:pPr>
+            <w:r/>
+            <w:r>
+              <w:rPr>
+                <w:rFonts w:ascii="Calibri" w:hAnsi="Calibri"/>
+                <w:b w:val="0"/>
+                <w:sz w:val="17"/>
+              </w:rPr>
+              <w:t>afh-location-function-app with route time, travel coverage, policies, and organisation assignment APIs.</w:t>
+            </w:r>
+          </w:p>
+        </w:tc>
+        <w:tc>
+          <w:tcPr>
+            <w:tcW w:type="dxa" w:w="3600"/>
+            <w:vAlign w:val="center"/>
+            <w:tcMar>
+              <w:top w:w="100" w:type="dxa"/>
+              <w:bottom w:w="100" w:type="dxa"/>
+              <w:start w:w="100" w:type="dxa"/>
+              <w:end w:w="100" w:type="dxa"/>
+            </w:tcMar>
+          </w:tcPr>
+          <w:p>
+            <w:pPr>
+              <w:spacing w:after="0"/>
+            </w:pPr>
+            <w:r/>
+            <w:r>
+              <w:rPr>
+                <w:rFonts w:ascii="Calibri" w:hAnsi="Calibri"/>
+                <w:b w:val="0"/>
+                <w:sz w:val="17"/>
+              </w:rPr>
+              <w:t>Expose location.* tools for route-time and travel-coverage queries.</w:t>
+            </w:r>
+          </w:p>
+        </w:tc>
+      </w:tr>
+      <w:tr>
+        <w:tc>
+          <w:tcPr>
+            <w:tcW w:type="dxa" w:w="1944"/>
+            <w:vAlign w:val="center"/>
+            <w:tcMar>
+              <w:top w:w="100" w:type="dxa"/>
+              <w:bottom w:w="100" w:type="dxa"/>
+              <w:start w:w="100" w:type="dxa"/>
+              <w:end w:w="100" w:type="dxa"/>
+            </w:tcMar>
+          </w:tcPr>
+          <w:p>
+            <w:pPr>
+              <w:spacing w:after="0"/>
+            </w:pPr>
+            <w:r/>
+            <w:r>
+              <w:rPr>
+                <w:rFonts w:ascii="Calibri" w:hAnsi="Calibri"/>
+                <w:b w:val="0"/>
+                <w:sz w:val="17"/>
+              </w:rPr>
+              <w:t>Adviser</w:t>
+            </w:r>
+          </w:p>
+        </w:tc>
+        <w:tc>
+          <w:tcPr>
+            <w:tcW w:type="dxa" w:w="3671"/>
+            <w:vAlign w:val="center"/>
+            <w:tcMar>
+              <w:top w:w="100" w:type="dxa"/>
+              <w:bottom w:w="100" w:type="dxa"/>
+              <w:start w:w="100" w:type="dxa"/>
+              <w:end w:w="100" w:type="dxa"/>
+            </w:tcMar>
+          </w:tcPr>
+          <w:p>
+            <w:pPr>
+              <w:spacing w:after="0"/>
+            </w:pPr>
+            <w:r/>
+            <w:r>
+              <w:rPr>
+                <w:rFonts w:ascii="Calibri" w:hAnsi="Calibri"/>
+                <w:b w:val="0"/>
+                <w:sz w:val="17"/>
+              </w:rPr>
+              <w:t>afh-adviser-function-app with adviser profiles, availability, coverage, specialisms, and sync APIs.</w:t>
+            </w:r>
+          </w:p>
+        </w:tc>
+        <w:tc>
+          <w:tcPr>
+            <w:tcW w:type="dxa" w:w="3600"/>
+            <w:vAlign w:val="center"/>
+            <w:tcMar>
+              <w:top w:w="100" w:type="dxa"/>
+              <w:bottom w:w="100" w:type="dxa"/>
+              <w:start w:w="100" w:type="dxa"/>
+              <w:end w:w="100" w:type="dxa"/>
+            </w:tcMar>
+          </w:tcPr>
+          <w:p>
+            <w:pPr>
+              <w:spacing w:after="0"/>
+            </w:pPr>
+            <w:r/>
+            <w:r>
+              <w:rPr>
+                <w:rFonts w:ascii="Calibri" w:hAnsi="Calibri"/>
+                <w:b w:val="0"/>
+                <w:sz w:val="17"/>
+              </w:rPr>
+              <w:t>Expose adviser.* tools for adviser profile, coverage, availability rules, and cache/sync status.</w:t>
+            </w:r>
+          </w:p>
+        </w:tc>
+      </w:tr>
+      <w:tr>
+        <w:tc>
+          <w:tcPr>
+            <w:tcW w:type="dxa" w:w="1944"/>
+            <w:vAlign w:val="center"/>
+            <w:tcMar>
+              <w:top w:w="100" w:type="dxa"/>
+              <w:bottom w:w="100" w:type="dxa"/>
+              <w:start w:w="100" w:type="dxa"/>
+              <w:end w:w="100" w:type="dxa"/>
+            </w:tcMar>
+          </w:tcPr>
+          <w:p>
+            <w:pPr>
+              <w:spacing w:after="0"/>
+            </w:pPr>
+            <w:r/>
+            <w:r>
+              <w:rPr>
+                <w:rFonts w:ascii="Calibri" w:hAnsi="Calibri"/>
+                <w:b w:val="0"/>
+                <w:sz w:val="17"/>
+              </w:rPr>
+              <w:t>Identity</w:t>
+            </w:r>
+          </w:p>
+        </w:tc>
+        <w:tc>
+          <w:tcPr>
+            <w:tcW w:type="dxa" w:w="3671"/>
+            <w:vAlign w:val="center"/>
+            <w:tcMar>
+              <w:top w:w="100" w:type="dxa"/>
+              <w:bottom w:w="100" w:type="dxa"/>
+              <w:start w:w="100" w:type="dxa"/>
+              <w:end w:w="100" w:type="dxa"/>
+            </w:tcMar>
+          </w:tcPr>
+          <w:p>
+            <w:pPr>
+              <w:spacing w:after="0"/>
+            </w:pPr>
+            <w:r/>
+            <w:r>
+              <w:rPr>
+                <w:rFonts w:ascii="Calibri" w:hAnsi="Calibri"/>
+                <w:b w:val="0"/>
+                <w:sz w:val="17"/>
+              </w:rPr>
+              <w:t>afh-identity-function-app with partners, users, roles, permissions, access scopes, and current-user context APIs.</w:t>
+            </w:r>
+          </w:p>
+        </w:tc>
+        <w:tc>
+          <w:tcPr>
+            <w:tcW w:type="dxa" w:w="3600"/>
+            <w:vAlign w:val="center"/>
+            <w:tcMar>
+              <w:top w:w="100" w:type="dxa"/>
+              <w:bottom w:w="100" w:type="dxa"/>
+              <w:start w:w="100" w:type="dxa"/>
+              <w:end w:w="100" w:type="dxa"/>
+            </w:tcMar>
+          </w:tcPr>
+          <w:p>
+            <w:pPr>
+              <w:spacing w:after="0"/>
+            </w:pPr>
+            <w:r/>
+            <w:r>
+              <w:rPr>
+                <w:rFonts w:ascii="Calibri" w:hAnsi="Calibri"/>
+                <w:b w:val="0"/>
+                <w:sz w:val="17"/>
+              </w:rPr>
+              <w:t>Expose identity.* only for controlled admin/read workflows; use it as the permission source for AI authorization.</w:t>
+            </w:r>
+          </w:p>
+        </w:tc>
+      </w:tr>
+      <w:tr>
+        <w:tc>
+          <w:tcPr>
+            <w:tcW w:type="dxa" w:w="1944"/>
+            <w:vAlign w:val="center"/>
+            <w:tcMar>
+              <w:top w:w="100" w:type="dxa"/>
+              <w:bottom w:w="100" w:type="dxa"/>
+              <w:start w:w="100" w:type="dxa"/>
+              <w:end w:w="100" w:type="dxa"/>
+            </w:tcMar>
+          </w:tcPr>
+          <w:p>
+            <w:pPr>
+              <w:spacing w:after="0"/>
+            </w:pPr>
+            <w:r/>
+            <w:r>
+              <w:rPr>
+                <w:rFonts w:ascii="Calibri" w:hAnsi="Calibri"/>
+                <w:b w:val="0"/>
+                <w:sz w:val="17"/>
+              </w:rPr>
+              <w:t>ACS</w:t>
+            </w:r>
+          </w:p>
+        </w:tc>
+        <w:tc>
+          <w:tcPr>
+            <w:tcW w:type="dxa" w:w="3671"/>
+            <w:vAlign w:val="center"/>
+            <w:tcMar>
+              <w:top w:w="100" w:type="dxa"/>
+              <w:bottom w:w="100" w:type="dxa"/>
+              <w:start w:w="100" w:type="dxa"/>
+              <w:end w:w="100" w:type="dxa"/>
+            </w:tcMar>
+          </w:tcPr>
+          <w:p>
+            <w:pPr>
+              <w:spacing w:after="0"/>
+            </w:pPr>
+            <w:r/>
+            <w:r>
+              <w:rPr>
+                <w:rFonts w:ascii="Calibri" w:hAnsi="Calibri"/>
+                <w:b w:val="0"/>
+                <w:sz w:val="17"/>
+              </w:rPr>
+              <w:t>afh-acs-function-app with meetings, join tokens, recordings, and transcription APIs.</w:t>
+            </w:r>
+          </w:p>
+        </w:tc>
+        <w:tc>
+          <w:tcPr>
+            <w:tcW w:type="dxa" w:w="3600"/>
+            <w:vAlign w:val="center"/>
+            <w:tcMar>
+              <w:top w:w="100" w:type="dxa"/>
+              <w:bottom w:w="100" w:type="dxa"/>
+              <w:start w:w="100" w:type="dxa"/>
+              <w:end w:w="100" w:type="dxa"/>
+            </w:tcMar>
+          </w:tcPr>
+          <w:p>
+            <w:pPr>
+              <w:spacing w:after="0"/>
+            </w:pPr>
+            <w:r/>
+            <w:r>
+              <w:rPr>
+                <w:rFonts w:ascii="Calibri" w:hAnsi="Calibri"/>
+                <w:b w:val="0"/>
+                <w:sz w:val="17"/>
+              </w:rPr>
+              <w:t>Expose acs.* tools for meeting lookup and transcription status/content where permissions allow.</w:t>
+            </w:r>
+          </w:p>
+        </w:tc>
+      </w:tr>
+      <w:tr>
+        <w:tc>
+          <w:tcPr>
+            <w:tcW w:type="dxa" w:w="1944"/>
+            <w:vAlign w:val="center"/>
+            <w:tcMar>
+              <w:top w:w="100" w:type="dxa"/>
+              <w:bottom w:w="100" w:type="dxa"/>
+              <w:start w:w="100" w:type="dxa"/>
+              <w:end w:w="100" w:type="dxa"/>
+            </w:tcMar>
+          </w:tcPr>
+          <w:p>
+            <w:pPr>
+              <w:spacing w:after="0"/>
+            </w:pPr>
+            <w:r/>
+            <w:r>
+              <w:rPr>
+                <w:rFonts w:ascii="Calibri" w:hAnsi="Calibri"/>
+                <w:b w:val="0"/>
+                <w:sz w:val="17"/>
+              </w:rPr>
+              <w:t>Client Integration</w:t>
+            </w:r>
+          </w:p>
+        </w:tc>
+        <w:tc>
+          <w:tcPr>
+            <w:tcW w:type="dxa" w:w="3671"/>
+            <w:vAlign w:val="center"/>
+            <w:tcMar>
+              <w:top w:w="100" w:type="dxa"/>
+              <w:bottom w:w="100" w:type="dxa"/>
+              <w:start w:w="100" w:type="dxa"/>
+              <w:end w:w="100" w:type="dxa"/>
+            </w:tcMar>
+          </w:tcPr>
+          <w:p>
+            <w:pPr>
+              <w:spacing w:after="0"/>
+            </w:pPr>
+            <w:r/>
+            <w:r>
+              <w:rPr>
+                <w:rFonts w:ascii="Calibri" w:hAnsi="Calibri"/>
+                <w:b w:val="0"/>
+                <w:sz w:val="17"/>
+              </w:rPr>
+              <w:t>afh-client-integration-function-app with XPlan, Snowflake, prospects, doc notes, status, and transaction APIs.</w:t>
+            </w:r>
+          </w:p>
+        </w:tc>
+        <w:tc>
+          <w:tcPr>
+            <w:tcW w:type="dxa" w:w="3600"/>
+            <w:vAlign w:val="center"/>
+            <w:tcMar>
+              <w:top w:w="100" w:type="dxa"/>
+              <w:bottom w:w="100" w:type="dxa"/>
+              <w:start w:w="100" w:type="dxa"/>
+              <w:end w:w="100" w:type="dxa"/>
+            </w:tcMar>
+          </w:tcPr>
+          <w:p>
+            <w:pPr>
+              <w:spacing w:after="0"/>
+            </w:pPr>
+            <w:r/>
+            <w:r>
+              <w:rPr>
+                <w:rFonts w:ascii="Calibri" w:hAnsi="Calibri"/>
+                <w:b w:val="0"/>
+                <w:sz w:val="17"/>
+              </w:rPr>
+              <w:t>Expose client.* tools for client/prospect lookup and integration status.</w:t>
+            </w:r>
+          </w:p>
+        </w:tc>
+      </w:tr>
+      <w:tr>
+        <w:tc>
+          <w:tcPr>
+            <w:tcW w:type="dxa" w:w="1944"/>
+            <w:vAlign w:val="center"/>
+            <w:tcMar>
+              <w:top w:w="100" w:type="dxa"/>
+              <w:bottom w:w="100" w:type="dxa"/>
+              <w:start w:w="100" w:type="dxa"/>
+              <w:end w:w="100" w:type="dxa"/>
+            </w:tcMar>
+          </w:tcPr>
+          <w:p>
+            <w:pPr>
+              <w:spacing w:after="0"/>
+            </w:pPr>
+            <w:r/>
+            <w:r>
+              <w:rPr>
+                <w:rFonts w:ascii="Calibri" w:hAnsi="Calibri"/>
+                <w:b w:val="0"/>
+                <w:sz w:val="17"/>
+              </w:rPr>
+              <w:t>AI MCP Gateway</w:t>
+            </w:r>
+          </w:p>
+        </w:tc>
+        <w:tc>
+          <w:tcPr>
+            <w:tcW w:type="dxa" w:w="3671"/>
+            <w:vAlign w:val="center"/>
+            <w:tcMar>
+              <w:top w:w="100" w:type="dxa"/>
+              <w:bottom w:w="100" w:type="dxa"/>
+              <w:start w:w="100" w:type="dxa"/>
+              <w:end w:w="100" w:type="dxa"/>
+            </w:tcMar>
+          </w:tcPr>
+          <w:p>
+            <w:pPr>
+              <w:spacing w:after="0"/>
+            </w:pPr>
+            <w:r/>
+            <w:r>
+              <w:rPr>
+                <w:rFonts w:ascii="Calibri" w:hAnsi="Calibri"/>
+                <w:b w:val="0"/>
+                <w:sz w:val="17"/>
+              </w:rPr>
+              <w:t>Not currently present.</w:t>
+            </w:r>
+          </w:p>
+        </w:tc>
+        <w:tc>
+          <w:tcPr>
+            <w:tcW w:type="dxa" w:w="3600"/>
+            <w:vAlign w:val="center"/>
+            <w:tcMar>
+              <w:top w:w="100" w:type="dxa"/>
+              <w:bottom w:w="100" w:type="dxa"/>
+              <w:start w:w="100" w:type="dxa"/>
+              <w:end w:w="100" w:type="dxa"/>
+            </w:tcMar>
+          </w:tcPr>
+          <w:p>
+            <w:pPr>
+              <w:spacing w:after="0"/>
+            </w:pPr>
+            <w:r/>
+            <w:r>
+              <w:rPr>
+                <w:rFonts w:ascii="Calibri" w:hAnsi="Calibri"/>
+                <w:b w:val="0"/>
+                <w:sz w:val="17"/>
+              </w:rPr>
+              <w:t>Add afh-ai-mcp-gateway-function-app under /services as the MCP protocol, routing, policy, discovery, and audit boundary.</w:t>
+            </w:r>
+          </w:p>
+        </w:tc>
+      </w:tr>
+      <w:tr>
+        <w:tc>
+          <w:tcPr>
+            <w:tcW w:type="dxa" w:w="1944"/>
+            <w:vAlign w:val="center"/>
+            <w:tcMar>
+              <w:top w:w="100" w:type="dxa"/>
+              <w:bottom w:w="100" w:type="dxa"/>
+              <w:start w:w="100" w:type="dxa"/>
+              <w:end w:w="100" w:type="dxa"/>
+            </w:tcMar>
+          </w:tcPr>
+          <w:p>
+            <w:pPr>
+              <w:spacing w:after="0"/>
+            </w:pPr>
+            <w:r/>
+            <w:r>
+              <w:rPr>
+                <w:rFonts w:ascii="Calibri" w:hAnsi="Calibri"/>
+                <w:b w:val="0"/>
+                <w:sz w:val="17"/>
+              </w:rPr>
+              <w:t>DevOps Integration</w:t>
+            </w:r>
+          </w:p>
+        </w:tc>
+        <w:tc>
+          <w:tcPr>
+            <w:tcW w:type="dxa" w:w="3671"/>
+            <w:vAlign w:val="center"/>
+            <w:tcMar>
+              <w:top w:w="100" w:type="dxa"/>
+              <w:bottom w:w="100" w:type="dxa"/>
+              <w:start w:w="100" w:type="dxa"/>
+              <w:end w:w="100" w:type="dxa"/>
+            </w:tcMar>
+          </w:tcPr>
+          <w:p>
+            <w:pPr>
+              <w:spacing w:after="0"/>
+            </w:pPr>
+            <w:r/>
+            <w:r>
+              <w:rPr>
+                <w:rFonts w:ascii="Calibri" w:hAnsi="Calibri"/>
+                <w:b w:val="0"/>
+                <w:sz w:val="17"/>
+              </w:rPr>
+              <w:t>Not currently present.</w:t>
+            </w:r>
+          </w:p>
+        </w:tc>
+        <w:tc>
+          <w:tcPr>
+            <w:tcW w:type="dxa" w:w="3600"/>
+            <w:vAlign w:val="center"/>
+            <w:tcMar>
+              <w:top w:w="100" w:type="dxa"/>
+              <w:bottom w:w="100" w:type="dxa"/>
+              <w:start w:w="100" w:type="dxa"/>
+              <w:end w:w="100" w:type="dxa"/>
+            </w:tcMar>
+          </w:tcPr>
+          <w:p>
+            <w:pPr>
+              <w:spacing w:after="0"/>
+            </w:pPr>
+            <w:r/>
+            <w:r>
+              <w:rPr>
+                <w:rFonts w:ascii="Calibri" w:hAnsi="Calibri"/>
+                <w:b w:val="0"/>
+                <w:sz w:val="17"/>
+              </w:rPr>
+              <w:t>Add afh-devops-integration-function-app under /services. Store Azure DevOps secrets in Key Vault/app settings or use managed identity. Keep workflows and secrets out of SDKs.</w:t>
+            </w:r>
+          </w:p>
+        </w:tc>
+      </w:tr>
+      <w:tr>
+        <w:tc>
+          <w:tcPr>
+            <w:tcW w:type="dxa" w:w="1944"/>
+            <w:vAlign w:val="center"/>
+            <w:tcMar>
+              <w:top w:w="100" w:type="dxa"/>
+              <w:bottom w:w="100" w:type="dxa"/>
+              <w:start w:w="100" w:type="dxa"/>
+              <w:end w:w="100" w:type="dxa"/>
+            </w:tcMar>
+          </w:tcPr>
+          <w:p>
+            <w:pPr>
+              <w:spacing w:after="0"/>
+            </w:pPr>
+            <w:r/>
+            <w:r>
+              <w:rPr>
+                <w:rFonts w:ascii="Calibri" w:hAnsi="Calibri"/>
+                <w:b w:val="0"/>
+                <w:sz w:val="17"/>
+              </w:rPr>
+              <w:t>AI/MCP SDKs</w:t>
+            </w:r>
+          </w:p>
+        </w:tc>
+        <w:tc>
+          <w:tcPr>
+            <w:tcW w:type="dxa" w:w="3671"/>
+            <w:vAlign w:val="center"/>
+            <w:tcMar>
+              <w:top w:w="100" w:type="dxa"/>
+              <w:bottom w:w="100" w:type="dxa"/>
+              <w:start w:w="100" w:type="dxa"/>
+              <w:end w:w="100" w:type="dxa"/>
+            </w:tcMar>
+          </w:tcPr>
+          <w:p>
+            <w:pPr>
+              <w:spacing w:after="0"/>
+            </w:pPr>
+            <w:r/>
+            <w:r>
+              <w:rPr>
+                <w:rFonts w:ascii="Calibri" w:hAnsi="Calibri"/>
+                <w:b w:val="0"/>
+                <w:sz w:val="17"/>
+              </w:rPr>
+              <w:t>Common SDKs exist for error, calendar, SharePoint, XPlan, and Speech AI.</w:t>
+            </w:r>
+          </w:p>
+        </w:tc>
+        <w:tc>
+          <w:tcPr>
+            <w:tcW w:type="dxa" w:w="3600"/>
+            <w:vAlign w:val="center"/>
+            <w:tcMar>
+              <w:top w:w="100" w:type="dxa"/>
+              <w:bottom w:w="100" w:type="dxa"/>
+              <w:start w:w="100" w:type="dxa"/>
+              <w:end w:w="100" w:type="dxa"/>
+            </w:tcMar>
+          </w:tcPr>
+          <w:p>
+            <w:pPr>
+              <w:spacing w:after="0"/>
+            </w:pPr>
+            <w:r/>
+            <w:r>
+              <w:rPr>
+                <w:rFonts w:ascii="Calibri" w:hAnsi="Calibri"/>
+                <w:b w:val="0"/>
+                <w:sz w:val="17"/>
+              </w:rPr>
+              <w:t>Add common AI/MCP contract SDKs only. These contain schemas and envelopes, not DevOps secrets or workflow logic.</w:t>
+            </w:r>
+          </w:p>
+        </w:tc>
+      </w:tr>
+    </w:tbl>
+    <w:p>
+      <w:pPr>
+        <w:spacing w:after="60"/>
+      </w:pPr>
+    </w:p>
+    <w:p>
+      <w:pPr>
         <w:pStyle w:val="Heading1"/>
       </w:pPr>
       <w:r>
@@ -1411,7 +2418,7 @@
         <w:spacing w:after="80"/>
       </w:pPr>
       <w:r>
-        <w:t>AI clients should not need to understand every AFH microservice, endpoint, authentication rule, or deployment topology.</w:t>
+        <w:t>AI clients would benefit from not having to understand every AFH microservice, endpoint, authentication rule, or deployment topology.</w:t>
       </w:r>
     </w:p>
     <w:p>
@@ -1577,7 +2584,7 @@
                 <w:b w:val="0"/>
                 <w:sz w:val="17"/>
               </w:rPr>
-              <w:t>AI access must be authenticated, authorized, auditable, rate-limited, and reversible where possible.</w:t>
+              <w:t>AI access is expected to be authenticated, authorized, auditable, rate-limited, and reversible where possible.</w:t>
             </w:r>
           </w:p>
         </w:tc>
@@ -1713,7 +2720,7 @@
                 <w:b w:val="0"/>
                 <w:sz w:val="17"/>
               </w:rPr>
-              <w:t>Avoid gateway sprawl</w:t>
+              <w:t>Limit gateway sprawl</w:t>
             </w:r>
           </w:p>
         </w:tc>
@@ -2297,7 +3304,7 @@
                 <w:color w:val="1F4D78"/>
                 <w:sz w:val="21"/>
               </w:rPr>
-              <w:t>Decision rationale</w:t>
+              <w:t>Proposal rationale</w:t>
             </w:r>
             <w:r>
               <w:br/>
@@ -2307,7 +3314,7 @@
                 <w:color w:val="12202F"/>
                 <w:sz w:val="20"/>
               </w:rPr>
-              <w:t>Adopt Option B first and design it so Option C is easy. Option A is attractive for service autonomy, but it weakens platform governance and makes AI clients responsible for too much internal topology.</w:t>
+              <w:t>The proposal favours Option B first, with a design that can evolve into Option C. Option A is attractive for service autonomy, but it weakens platform governance and makes AI clients responsible for too much internal topology.</w:t>
             </w:r>
           </w:p>
         </w:tc>
@@ -2323,12 +3330,12 @@
         <w:pStyle w:val="Heading1"/>
       </w:pPr>
       <w:r>
-        <w:t>6. Recommended MCP Gateway architecture</w:t>
+        <w:t>6. Proposed MCP Gateway architecture</w:t>
       </w:r>
     </w:p>
     <w:p>
       <w:r>
-        <w:t>The MCP Gateway should live under /services as a separate Azure Functions service named afh-ai-mcp-gateway-function-app. It should not reference existing service Application or Infrastructure projects directly. Instead, it should call downstream service APIs through HTTP by default and use asynchronous messaging for long-running workflows.</w:t>
+        <w:t>The proposed location for the MCP Gateway is /services as a separate Azure Functions service named afh-ai-mcp-gateway-function-app. The preferred integration style is service APIs rather than direct references to existing service Application or Infrastructure projects. HTTP is the proposed default for downstream service calls, with asynchronous messaging reserved for long-running workflows.</w:t>
       </w:r>
     </w:p>
     <w:tbl>
@@ -2676,6 +3683,1683 @@
       <w:pPr>
         <w:spacing w:after="60"/>
       </w:pPr>
+    </w:p>
+    <w:p>
+      <w:pPr>
+        <w:pStyle w:val="Heading2"/>
+      </w:pPr>
+      <w:r>
+        <w:t>6.1 Example proposed endpoints and tool mappings</w:t>
+      </w:r>
+    </w:p>
+    <w:p>
+      <w:r>
+        <w:t>The following examples illustrate how AI tools can map to service-owned HTTP endpoints. Exact routes would be confirmed during implementation against the existing API contracts and security model.</w:t>
+      </w:r>
+    </w:p>
+    <w:tbl>
+      <w:tblPr>
+        <w:tblStyle w:val="TableGrid"/>
+        <w:tblW w:type="auto" w:w="0"/>
+        <w:jc w:val="center"/>
+        <w:tblLayout w:type="fixed"/>
+        <w:tblLook w:firstColumn="1" w:firstRow="1" w:lastColumn="0" w:lastRow="0" w:noHBand="0" w:noVBand="1" w:val="04A0"/>
+      </w:tblPr>
+      <w:tblGrid>
+        <w:gridCol w:w="2340"/>
+        <w:gridCol w:w="2340"/>
+        <w:gridCol w:w="2340"/>
+        <w:gridCol w:w="2340"/>
+      </w:tblGrid>
+      <w:tr>
+        <w:tc>
+          <w:tcPr>
+            <w:tcW w:type="dxa" w:w="2232"/>
+            <w:shd w:fill="E8EEF5"/>
+            <w:vAlign w:val="center"/>
+            <w:tcMar>
+              <w:top w:w="100" w:type="dxa"/>
+              <w:bottom w:w="100" w:type="dxa"/>
+              <w:start w:w="100" w:type="dxa"/>
+              <w:end w:w="100" w:type="dxa"/>
+            </w:tcMar>
+          </w:tcPr>
+          <w:p>
+            <w:pPr>
+              <w:spacing w:after="0"/>
+            </w:pPr>
+            <w:r/>
+            <w:r>
+              <w:rPr>
+                <w:rFonts w:ascii="Calibri" w:hAnsi="Calibri"/>
+                <w:b/>
+                <w:color w:val="12202F"/>
+                <w:sz w:val="18"/>
+              </w:rPr>
+              <w:t>Tool</w:t>
+            </w:r>
+          </w:p>
+        </w:tc>
+        <w:tc>
+          <w:tcPr>
+            <w:tcW w:type="dxa" w:w="1800"/>
+            <w:shd w:fill="E8EEF5"/>
+            <w:vAlign w:val="center"/>
+            <w:tcMar>
+              <w:top w:w="100" w:type="dxa"/>
+              <w:bottom w:w="100" w:type="dxa"/>
+              <w:start w:w="100" w:type="dxa"/>
+              <w:end w:w="100" w:type="dxa"/>
+            </w:tcMar>
+          </w:tcPr>
+          <w:p>
+            <w:pPr>
+              <w:spacing w:after="0"/>
+            </w:pPr>
+            <w:r/>
+            <w:r>
+              <w:rPr>
+                <w:rFonts w:ascii="Calibri" w:hAnsi="Calibri"/>
+                <w:b/>
+                <w:color w:val="12202F"/>
+                <w:sz w:val="18"/>
+              </w:rPr>
+              <w:t>Owning service</w:t>
+            </w:r>
+          </w:p>
+        </w:tc>
+        <w:tc>
+          <w:tcPr>
+            <w:tcW w:type="dxa" w:w="4176"/>
+            <w:shd w:fill="E8EEF5"/>
+            <w:vAlign w:val="center"/>
+            <w:tcMar>
+              <w:top w:w="100" w:type="dxa"/>
+              <w:bottom w:w="100" w:type="dxa"/>
+              <w:start w:w="100" w:type="dxa"/>
+              <w:end w:w="100" w:type="dxa"/>
+            </w:tcMar>
+          </w:tcPr>
+          <w:p>
+            <w:pPr>
+              <w:spacing w:after="0"/>
+            </w:pPr>
+            <w:r/>
+            <w:r>
+              <w:rPr>
+                <w:rFonts w:ascii="Calibri" w:hAnsi="Calibri"/>
+                <w:b/>
+                <w:color w:val="12202F"/>
+                <w:sz w:val="18"/>
+              </w:rPr>
+              <w:t>Example downstream endpoint</w:t>
+            </w:r>
+          </w:p>
+        </w:tc>
+        <w:tc>
+          <w:tcPr>
+            <w:tcW w:type="dxa" w:w="1007"/>
+            <w:shd w:fill="E8EEF5"/>
+            <w:vAlign w:val="center"/>
+            <w:tcMar>
+              <w:top w:w="100" w:type="dxa"/>
+              <w:bottom w:w="100" w:type="dxa"/>
+              <w:start w:w="100" w:type="dxa"/>
+              <w:end w:w="100" w:type="dxa"/>
+            </w:tcMar>
+          </w:tcPr>
+          <w:p>
+            <w:pPr>
+              <w:spacing w:after="0"/>
+            </w:pPr>
+            <w:r/>
+            <w:r>
+              <w:rPr>
+                <w:rFonts w:ascii="Calibri" w:hAnsi="Calibri"/>
+                <w:b/>
+                <w:color w:val="12202F"/>
+                <w:sz w:val="18"/>
+              </w:rPr>
+              <w:t>Side effect</w:t>
+            </w:r>
+          </w:p>
+        </w:tc>
+      </w:tr>
+      <w:tr>
+        <w:tc>
+          <w:tcPr>
+            <w:tcW w:type="dxa" w:w="2232"/>
+            <w:vAlign w:val="center"/>
+            <w:tcMar>
+              <w:top w:w="100" w:type="dxa"/>
+              <w:bottom w:w="100" w:type="dxa"/>
+              <w:start w:w="100" w:type="dxa"/>
+              <w:end w:w="100" w:type="dxa"/>
+            </w:tcMar>
+          </w:tcPr>
+          <w:p>
+            <w:pPr>
+              <w:spacing w:after="0"/>
+            </w:pPr>
+            <w:r/>
+            <w:r>
+              <w:rPr>
+                <w:rFonts w:ascii="Calibri" w:hAnsi="Calibri"/>
+                <w:b w:val="0"/>
+                <w:sz w:val="17"/>
+              </w:rPr>
+              <w:t>booking.search</w:t>
+            </w:r>
+          </w:p>
+        </w:tc>
+        <w:tc>
+          <w:tcPr>
+            <w:tcW w:type="dxa" w:w="1800"/>
+            <w:vAlign w:val="center"/>
+            <w:tcMar>
+              <w:top w:w="100" w:type="dxa"/>
+              <w:bottom w:w="100" w:type="dxa"/>
+              <w:start w:w="100" w:type="dxa"/>
+              <w:end w:w="100" w:type="dxa"/>
+            </w:tcMar>
+          </w:tcPr>
+          <w:p>
+            <w:pPr>
+              <w:spacing w:after="0"/>
+            </w:pPr>
+            <w:r/>
+            <w:r>
+              <w:rPr>
+                <w:rFonts w:ascii="Calibri" w:hAnsi="Calibri"/>
+                <w:b w:val="0"/>
+                <w:sz w:val="17"/>
+              </w:rPr>
+              <w:t>Booking</w:t>
+            </w:r>
+          </w:p>
+        </w:tc>
+        <w:tc>
+          <w:tcPr>
+            <w:tcW w:type="dxa" w:w="4176"/>
+            <w:vAlign w:val="center"/>
+            <w:tcMar>
+              <w:top w:w="100" w:type="dxa"/>
+              <w:bottom w:w="100" w:type="dxa"/>
+              <w:start w:w="100" w:type="dxa"/>
+              <w:end w:w="100" w:type="dxa"/>
+            </w:tcMar>
+          </w:tcPr>
+          <w:p>
+            <w:pPr>
+              <w:spacing w:after="0"/>
+            </w:pPr>
+            <w:r/>
+            <w:r>
+              <w:rPr>
+                <w:rFonts w:ascii="Calibri" w:hAnsi="Calibri"/>
+                <w:b w:val="0"/>
+                <w:sz w:val="17"/>
+              </w:rPr>
+              <w:t>GET /v1/admin/bookings?from={date}&amp;to={date}&amp;adviserId={id}</w:t>
+            </w:r>
+          </w:p>
+        </w:tc>
+        <w:tc>
+          <w:tcPr>
+            <w:tcW w:type="dxa" w:w="1007"/>
+            <w:vAlign w:val="center"/>
+            <w:tcMar>
+              <w:top w:w="100" w:type="dxa"/>
+              <w:bottom w:w="100" w:type="dxa"/>
+              <w:start w:w="100" w:type="dxa"/>
+              <w:end w:w="100" w:type="dxa"/>
+            </w:tcMar>
+          </w:tcPr>
+          <w:p>
+            <w:pPr>
+              <w:spacing w:after="0"/>
+            </w:pPr>
+            <w:r/>
+            <w:r>
+              <w:rPr>
+                <w:rFonts w:ascii="Calibri" w:hAnsi="Calibri"/>
+                <w:b w:val="0"/>
+                <w:sz w:val="17"/>
+              </w:rPr>
+              <w:t>Read</w:t>
+            </w:r>
+          </w:p>
+        </w:tc>
+      </w:tr>
+      <w:tr>
+        <w:tc>
+          <w:tcPr>
+            <w:tcW w:type="dxa" w:w="2232"/>
+            <w:vAlign w:val="center"/>
+            <w:tcMar>
+              <w:top w:w="100" w:type="dxa"/>
+              <w:bottom w:w="100" w:type="dxa"/>
+              <w:start w:w="100" w:type="dxa"/>
+              <w:end w:w="100" w:type="dxa"/>
+            </w:tcMar>
+          </w:tcPr>
+          <w:p>
+            <w:pPr>
+              <w:spacing w:after="0"/>
+            </w:pPr>
+            <w:r/>
+            <w:r>
+              <w:rPr>
+                <w:rFonts w:ascii="Calibri" w:hAnsi="Calibri"/>
+                <w:b w:val="0"/>
+                <w:sz w:val="17"/>
+              </w:rPr>
+              <w:t>booking.get_lifecycle</w:t>
+            </w:r>
+          </w:p>
+        </w:tc>
+        <w:tc>
+          <w:tcPr>
+            <w:tcW w:type="dxa" w:w="1800"/>
+            <w:vAlign w:val="center"/>
+            <w:tcMar>
+              <w:top w:w="100" w:type="dxa"/>
+              <w:bottom w:w="100" w:type="dxa"/>
+              <w:start w:w="100" w:type="dxa"/>
+              <w:end w:w="100" w:type="dxa"/>
+            </w:tcMar>
+          </w:tcPr>
+          <w:p>
+            <w:pPr>
+              <w:spacing w:after="0"/>
+            </w:pPr>
+            <w:r/>
+            <w:r>
+              <w:rPr>
+                <w:rFonts w:ascii="Calibri" w:hAnsi="Calibri"/>
+                <w:b w:val="0"/>
+                <w:sz w:val="17"/>
+              </w:rPr>
+              <w:t>Booking</w:t>
+            </w:r>
+          </w:p>
+        </w:tc>
+        <w:tc>
+          <w:tcPr>
+            <w:tcW w:type="dxa" w:w="4176"/>
+            <w:vAlign w:val="center"/>
+            <w:tcMar>
+              <w:top w:w="100" w:type="dxa"/>
+              <w:bottom w:w="100" w:type="dxa"/>
+              <w:start w:w="100" w:type="dxa"/>
+              <w:end w:w="100" w:type="dxa"/>
+            </w:tcMar>
+          </w:tcPr>
+          <w:p>
+            <w:pPr>
+              <w:spacing w:after="0"/>
+            </w:pPr>
+            <w:r/>
+            <w:r>
+              <w:rPr>
+                <w:rFonts w:ascii="Calibri" w:hAnsi="Calibri"/>
+                <w:b w:val="0"/>
+                <w:sz w:val="17"/>
+              </w:rPr>
+              <w:t>GET /v1/bookings/{bookingId}/lifecycle</w:t>
+            </w:r>
+          </w:p>
+        </w:tc>
+        <w:tc>
+          <w:tcPr>
+            <w:tcW w:type="dxa" w:w="1007"/>
+            <w:vAlign w:val="center"/>
+            <w:tcMar>
+              <w:top w:w="100" w:type="dxa"/>
+              <w:bottom w:w="100" w:type="dxa"/>
+              <w:start w:w="100" w:type="dxa"/>
+              <w:end w:w="100" w:type="dxa"/>
+            </w:tcMar>
+          </w:tcPr>
+          <w:p>
+            <w:pPr>
+              <w:spacing w:after="0"/>
+            </w:pPr>
+            <w:r/>
+            <w:r>
+              <w:rPr>
+                <w:rFonts w:ascii="Calibri" w:hAnsi="Calibri"/>
+                <w:b w:val="0"/>
+                <w:sz w:val="17"/>
+              </w:rPr>
+              <w:t>Read</w:t>
+            </w:r>
+          </w:p>
+        </w:tc>
+      </w:tr>
+      <w:tr>
+        <w:tc>
+          <w:tcPr>
+            <w:tcW w:type="dxa" w:w="2232"/>
+            <w:vAlign w:val="center"/>
+            <w:tcMar>
+              <w:top w:w="100" w:type="dxa"/>
+              <w:bottom w:w="100" w:type="dxa"/>
+              <w:start w:w="100" w:type="dxa"/>
+              <w:end w:w="100" w:type="dxa"/>
+            </w:tcMar>
+          </w:tcPr>
+          <w:p>
+            <w:pPr>
+              <w:spacing w:after="0"/>
+            </w:pPr>
+            <w:r/>
+            <w:r>
+              <w:rPr>
+                <w:rFonts w:ascii="Calibri" w:hAnsi="Calibri"/>
+                <w:b w:val="0"/>
+                <w:sz w:val="17"/>
+              </w:rPr>
+              <w:t>booking.find_availability</w:t>
+            </w:r>
+          </w:p>
+        </w:tc>
+        <w:tc>
+          <w:tcPr>
+            <w:tcW w:type="dxa" w:w="1800"/>
+            <w:vAlign w:val="center"/>
+            <w:tcMar>
+              <w:top w:w="100" w:type="dxa"/>
+              <w:bottom w:w="100" w:type="dxa"/>
+              <w:start w:w="100" w:type="dxa"/>
+              <w:end w:w="100" w:type="dxa"/>
+            </w:tcMar>
+          </w:tcPr>
+          <w:p>
+            <w:pPr>
+              <w:spacing w:after="0"/>
+            </w:pPr>
+            <w:r/>
+            <w:r>
+              <w:rPr>
+                <w:rFonts w:ascii="Calibri" w:hAnsi="Calibri"/>
+                <w:b w:val="0"/>
+                <w:sz w:val="17"/>
+              </w:rPr>
+              <w:t>Booking</w:t>
+            </w:r>
+          </w:p>
+        </w:tc>
+        <w:tc>
+          <w:tcPr>
+            <w:tcW w:type="dxa" w:w="4176"/>
+            <w:vAlign w:val="center"/>
+            <w:tcMar>
+              <w:top w:w="100" w:type="dxa"/>
+              <w:bottom w:w="100" w:type="dxa"/>
+              <w:start w:w="100" w:type="dxa"/>
+              <w:end w:w="100" w:type="dxa"/>
+            </w:tcMar>
+          </w:tcPr>
+          <w:p>
+            <w:pPr>
+              <w:spacing w:after="0"/>
+            </w:pPr>
+            <w:r/>
+            <w:r>
+              <w:rPr>
+                <w:rFonts w:ascii="Calibri" w:hAnsi="Calibri"/>
+                <w:b w:val="0"/>
+                <w:sz w:val="17"/>
+              </w:rPr>
+              <w:t>POST /v2/transactions/{transactionId}/availability</w:t>
+            </w:r>
+          </w:p>
+        </w:tc>
+        <w:tc>
+          <w:tcPr>
+            <w:tcW w:type="dxa" w:w="1007"/>
+            <w:vAlign w:val="center"/>
+            <w:tcMar>
+              <w:top w:w="100" w:type="dxa"/>
+              <w:bottom w:w="100" w:type="dxa"/>
+              <w:start w:w="100" w:type="dxa"/>
+              <w:end w:w="100" w:type="dxa"/>
+            </w:tcMar>
+          </w:tcPr>
+          <w:p>
+            <w:pPr>
+              <w:spacing w:after="0"/>
+            </w:pPr>
+            <w:r/>
+            <w:r>
+              <w:rPr>
+                <w:rFonts w:ascii="Calibri" w:hAnsi="Calibri"/>
+                <w:b w:val="0"/>
+                <w:sz w:val="17"/>
+              </w:rPr>
+              <w:t>Read/calculation</w:t>
+            </w:r>
+          </w:p>
+        </w:tc>
+      </w:tr>
+      <w:tr>
+        <w:tc>
+          <w:tcPr>
+            <w:tcW w:type="dxa" w:w="2232"/>
+            <w:vAlign w:val="center"/>
+            <w:tcMar>
+              <w:top w:w="100" w:type="dxa"/>
+              <w:bottom w:w="100" w:type="dxa"/>
+              <w:start w:w="100" w:type="dxa"/>
+              <w:end w:w="100" w:type="dxa"/>
+            </w:tcMar>
+          </w:tcPr>
+          <w:p>
+            <w:pPr>
+              <w:spacing w:after="0"/>
+            </w:pPr>
+            <w:r/>
+            <w:r>
+              <w:rPr>
+                <w:rFonts w:ascii="Calibri" w:hAnsi="Calibri"/>
+                <w:b w:val="0"/>
+                <w:sz w:val="17"/>
+              </w:rPr>
+              <w:t>calendar.get_schedule</w:t>
+            </w:r>
+          </w:p>
+        </w:tc>
+        <w:tc>
+          <w:tcPr>
+            <w:tcW w:type="dxa" w:w="1800"/>
+            <w:vAlign w:val="center"/>
+            <w:tcMar>
+              <w:top w:w="100" w:type="dxa"/>
+              <w:bottom w:w="100" w:type="dxa"/>
+              <w:start w:w="100" w:type="dxa"/>
+              <w:end w:w="100" w:type="dxa"/>
+            </w:tcMar>
+          </w:tcPr>
+          <w:p>
+            <w:pPr>
+              <w:spacing w:after="0"/>
+            </w:pPr>
+            <w:r/>
+            <w:r>
+              <w:rPr>
+                <w:rFonts w:ascii="Calibri" w:hAnsi="Calibri"/>
+                <w:b w:val="0"/>
+                <w:sz w:val="17"/>
+              </w:rPr>
+              <w:t>Calendar</w:t>
+            </w:r>
+          </w:p>
+        </w:tc>
+        <w:tc>
+          <w:tcPr>
+            <w:tcW w:type="dxa" w:w="4176"/>
+            <w:vAlign w:val="center"/>
+            <w:tcMar>
+              <w:top w:w="100" w:type="dxa"/>
+              <w:bottom w:w="100" w:type="dxa"/>
+              <w:start w:w="100" w:type="dxa"/>
+              <w:end w:w="100" w:type="dxa"/>
+            </w:tcMar>
+          </w:tcPr>
+          <w:p>
+            <w:pPr>
+              <w:spacing w:after="0"/>
+            </w:pPr>
+            <w:r/>
+            <w:r>
+              <w:rPr>
+                <w:rFonts w:ascii="Calibri" w:hAnsi="Calibri"/>
+                <w:b w:val="0"/>
+                <w:sz w:val="17"/>
+              </w:rPr>
+              <w:t>GET /v1/calendar/users/{userId}/schedule?start={utc}&amp;end={utc}</w:t>
+            </w:r>
+          </w:p>
+        </w:tc>
+        <w:tc>
+          <w:tcPr>
+            <w:tcW w:type="dxa" w:w="1007"/>
+            <w:vAlign w:val="center"/>
+            <w:tcMar>
+              <w:top w:w="100" w:type="dxa"/>
+              <w:bottom w:w="100" w:type="dxa"/>
+              <w:start w:w="100" w:type="dxa"/>
+              <w:end w:w="100" w:type="dxa"/>
+            </w:tcMar>
+          </w:tcPr>
+          <w:p>
+            <w:pPr>
+              <w:spacing w:after="0"/>
+            </w:pPr>
+            <w:r/>
+            <w:r>
+              <w:rPr>
+                <w:rFonts w:ascii="Calibri" w:hAnsi="Calibri"/>
+                <w:b w:val="0"/>
+                <w:sz w:val="17"/>
+              </w:rPr>
+              <w:t>Read</w:t>
+            </w:r>
+          </w:p>
+        </w:tc>
+      </w:tr>
+      <w:tr>
+        <w:tc>
+          <w:tcPr>
+            <w:tcW w:type="dxa" w:w="2232"/>
+            <w:vAlign w:val="center"/>
+            <w:tcMar>
+              <w:top w:w="100" w:type="dxa"/>
+              <w:bottom w:w="100" w:type="dxa"/>
+              <w:start w:w="100" w:type="dxa"/>
+              <w:end w:w="100" w:type="dxa"/>
+            </w:tcMar>
+          </w:tcPr>
+          <w:p>
+            <w:pPr>
+              <w:spacing w:after="0"/>
+            </w:pPr>
+            <w:r/>
+            <w:r>
+              <w:rPr>
+                <w:rFonts w:ascii="Calibri" w:hAnsi="Calibri"/>
+                <w:b w:val="0"/>
+                <w:sz w:val="17"/>
+              </w:rPr>
+              <w:t>calendar.ensure_subscriptions</w:t>
+            </w:r>
+          </w:p>
+        </w:tc>
+        <w:tc>
+          <w:tcPr>
+            <w:tcW w:type="dxa" w:w="1800"/>
+            <w:vAlign w:val="center"/>
+            <w:tcMar>
+              <w:top w:w="100" w:type="dxa"/>
+              <w:bottom w:w="100" w:type="dxa"/>
+              <w:start w:w="100" w:type="dxa"/>
+              <w:end w:w="100" w:type="dxa"/>
+            </w:tcMar>
+          </w:tcPr>
+          <w:p>
+            <w:pPr>
+              <w:spacing w:after="0"/>
+            </w:pPr>
+            <w:r/>
+            <w:r>
+              <w:rPr>
+                <w:rFonts w:ascii="Calibri" w:hAnsi="Calibri"/>
+                <w:b w:val="0"/>
+                <w:sz w:val="17"/>
+              </w:rPr>
+              <w:t>Calendar</w:t>
+            </w:r>
+          </w:p>
+        </w:tc>
+        <w:tc>
+          <w:tcPr>
+            <w:tcW w:type="dxa" w:w="4176"/>
+            <w:vAlign w:val="center"/>
+            <w:tcMar>
+              <w:top w:w="100" w:type="dxa"/>
+              <w:bottom w:w="100" w:type="dxa"/>
+              <w:start w:w="100" w:type="dxa"/>
+              <w:end w:w="100" w:type="dxa"/>
+            </w:tcMar>
+          </w:tcPr>
+          <w:p>
+            <w:pPr>
+              <w:spacing w:after="0"/>
+            </w:pPr>
+            <w:r/>
+            <w:r>
+              <w:rPr>
+                <w:rFonts w:ascii="Calibri" w:hAnsi="Calibri"/>
+                <w:b w:val="0"/>
+                <w:sz w:val="17"/>
+              </w:rPr>
+              <w:t>POST /v1/calendar/subscriptions/ensure</w:t>
+            </w:r>
+          </w:p>
+        </w:tc>
+        <w:tc>
+          <w:tcPr>
+            <w:tcW w:type="dxa" w:w="1007"/>
+            <w:vAlign w:val="center"/>
+            <w:tcMar>
+              <w:top w:w="100" w:type="dxa"/>
+              <w:bottom w:w="100" w:type="dxa"/>
+              <w:start w:w="100" w:type="dxa"/>
+              <w:end w:w="100" w:type="dxa"/>
+            </w:tcMar>
+          </w:tcPr>
+          <w:p>
+            <w:pPr>
+              <w:spacing w:after="0"/>
+            </w:pPr>
+            <w:r/>
+            <w:r>
+              <w:rPr>
+                <w:rFonts w:ascii="Calibri" w:hAnsi="Calibri"/>
+                <w:b w:val="0"/>
+                <w:sz w:val="17"/>
+              </w:rPr>
+              <w:t>Write/operational</w:t>
+            </w:r>
+          </w:p>
+        </w:tc>
+      </w:tr>
+      <w:tr>
+        <w:tc>
+          <w:tcPr>
+            <w:tcW w:type="dxa" w:w="2232"/>
+            <w:vAlign w:val="center"/>
+            <w:tcMar>
+              <w:top w:w="100" w:type="dxa"/>
+              <w:bottom w:w="100" w:type="dxa"/>
+              <w:start w:w="100" w:type="dxa"/>
+              <w:end w:w="100" w:type="dxa"/>
+            </w:tcMar>
+          </w:tcPr>
+          <w:p>
+            <w:pPr>
+              <w:spacing w:after="0"/>
+            </w:pPr>
+            <w:r/>
+            <w:r>
+              <w:rPr>
+                <w:rFonts w:ascii="Calibri" w:hAnsi="Calibri"/>
+                <w:b w:val="0"/>
+                <w:sz w:val="17"/>
+              </w:rPr>
+              <w:t>notification.get_request</w:t>
+            </w:r>
+          </w:p>
+        </w:tc>
+        <w:tc>
+          <w:tcPr>
+            <w:tcW w:type="dxa" w:w="1800"/>
+            <w:vAlign w:val="center"/>
+            <w:tcMar>
+              <w:top w:w="100" w:type="dxa"/>
+              <w:bottom w:w="100" w:type="dxa"/>
+              <w:start w:w="100" w:type="dxa"/>
+              <w:end w:w="100" w:type="dxa"/>
+            </w:tcMar>
+          </w:tcPr>
+          <w:p>
+            <w:pPr>
+              <w:spacing w:after="0"/>
+            </w:pPr>
+            <w:r/>
+            <w:r>
+              <w:rPr>
+                <w:rFonts w:ascii="Calibri" w:hAnsi="Calibri"/>
+                <w:b w:val="0"/>
+                <w:sz w:val="17"/>
+              </w:rPr>
+              <w:t>Notification</w:t>
+            </w:r>
+          </w:p>
+        </w:tc>
+        <w:tc>
+          <w:tcPr>
+            <w:tcW w:type="dxa" w:w="4176"/>
+            <w:vAlign w:val="center"/>
+            <w:tcMar>
+              <w:top w:w="100" w:type="dxa"/>
+              <w:bottom w:w="100" w:type="dxa"/>
+              <w:start w:w="100" w:type="dxa"/>
+              <w:end w:w="100" w:type="dxa"/>
+            </w:tcMar>
+          </w:tcPr>
+          <w:p>
+            <w:pPr>
+              <w:spacing w:after="0"/>
+            </w:pPr>
+            <w:r/>
+            <w:r>
+              <w:rPr>
+                <w:rFonts w:ascii="Calibri" w:hAnsi="Calibri"/>
+                <w:b w:val="0"/>
+                <w:sz w:val="17"/>
+              </w:rPr>
+              <w:t>GET /v1/notifications/requests/{id}</w:t>
+            </w:r>
+          </w:p>
+        </w:tc>
+        <w:tc>
+          <w:tcPr>
+            <w:tcW w:type="dxa" w:w="1007"/>
+            <w:vAlign w:val="center"/>
+            <w:tcMar>
+              <w:top w:w="100" w:type="dxa"/>
+              <w:bottom w:w="100" w:type="dxa"/>
+              <w:start w:w="100" w:type="dxa"/>
+              <w:end w:w="100" w:type="dxa"/>
+            </w:tcMar>
+          </w:tcPr>
+          <w:p>
+            <w:pPr>
+              <w:spacing w:after="0"/>
+            </w:pPr>
+            <w:r/>
+            <w:r>
+              <w:rPr>
+                <w:rFonts w:ascii="Calibri" w:hAnsi="Calibri"/>
+                <w:b w:val="0"/>
+                <w:sz w:val="17"/>
+              </w:rPr>
+              <w:t>Read</w:t>
+            </w:r>
+          </w:p>
+        </w:tc>
+      </w:tr>
+      <w:tr>
+        <w:tc>
+          <w:tcPr>
+            <w:tcW w:type="dxa" w:w="2232"/>
+            <w:vAlign w:val="center"/>
+            <w:tcMar>
+              <w:top w:w="100" w:type="dxa"/>
+              <w:bottom w:w="100" w:type="dxa"/>
+              <w:start w:w="100" w:type="dxa"/>
+              <w:end w:w="100" w:type="dxa"/>
+            </w:tcMar>
+          </w:tcPr>
+          <w:p>
+            <w:pPr>
+              <w:spacing w:after="0"/>
+            </w:pPr>
+            <w:r/>
+            <w:r>
+              <w:rPr>
+                <w:rFonts w:ascii="Calibri" w:hAnsi="Calibri"/>
+                <w:b w:val="0"/>
+                <w:sz w:val="17"/>
+              </w:rPr>
+              <w:t>notification.requeue_request</w:t>
+            </w:r>
+          </w:p>
+        </w:tc>
+        <w:tc>
+          <w:tcPr>
+            <w:tcW w:type="dxa" w:w="1800"/>
+            <w:vAlign w:val="center"/>
+            <w:tcMar>
+              <w:top w:w="100" w:type="dxa"/>
+              <w:bottom w:w="100" w:type="dxa"/>
+              <w:start w:w="100" w:type="dxa"/>
+              <w:end w:w="100" w:type="dxa"/>
+            </w:tcMar>
+          </w:tcPr>
+          <w:p>
+            <w:pPr>
+              <w:spacing w:after="0"/>
+            </w:pPr>
+            <w:r/>
+            <w:r>
+              <w:rPr>
+                <w:rFonts w:ascii="Calibri" w:hAnsi="Calibri"/>
+                <w:b w:val="0"/>
+                <w:sz w:val="17"/>
+              </w:rPr>
+              <w:t>Notification</w:t>
+            </w:r>
+          </w:p>
+        </w:tc>
+        <w:tc>
+          <w:tcPr>
+            <w:tcW w:type="dxa" w:w="4176"/>
+            <w:vAlign w:val="center"/>
+            <w:tcMar>
+              <w:top w:w="100" w:type="dxa"/>
+              <w:bottom w:w="100" w:type="dxa"/>
+              <w:start w:w="100" w:type="dxa"/>
+              <w:end w:w="100" w:type="dxa"/>
+            </w:tcMar>
+          </w:tcPr>
+          <w:p>
+            <w:pPr>
+              <w:spacing w:after="0"/>
+            </w:pPr>
+            <w:r/>
+            <w:r>
+              <w:rPr>
+                <w:rFonts w:ascii="Calibri" w:hAnsi="Calibri"/>
+                <w:b w:val="0"/>
+                <w:sz w:val="17"/>
+              </w:rPr>
+              <w:t>POST /v1/notifications/requests/{id}/requeue</w:t>
+            </w:r>
+          </w:p>
+        </w:tc>
+        <w:tc>
+          <w:tcPr>
+            <w:tcW w:type="dxa" w:w="1007"/>
+            <w:vAlign w:val="center"/>
+            <w:tcMar>
+              <w:top w:w="100" w:type="dxa"/>
+              <w:bottom w:w="100" w:type="dxa"/>
+              <w:start w:w="100" w:type="dxa"/>
+              <w:end w:w="100" w:type="dxa"/>
+            </w:tcMar>
+          </w:tcPr>
+          <w:p>
+            <w:pPr>
+              <w:spacing w:after="0"/>
+            </w:pPr>
+            <w:r/>
+            <w:r>
+              <w:rPr>
+                <w:rFonts w:ascii="Calibri" w:hAnsi="Calibri"/>
+                <w:b w:val="0"/>
+                <w:sz w:val="17"/>
+              </w:rPr>
+              <w:t>Write; approval proposed</w:t>
+            </w:r>
+          </w:p>
+        </w:tc>
+      </w:tr>
+      <w:tr>
+        <w:tc>
+          <w:tcPr>
+            <w:tcW w:type="dxa" w:w="2232"/>
+            <w:vAlign w:val="center"/>
+            <w:tcMar>
+              <w:top w:w="100" w:type="dxa"/>
+              <w:bottom w:w="100" w:type="dxa"/>
+              <w:start w:w="100" w:type="dxa"/>
+              <w:end w:w="100" w:type="dxa"/>
+            </w:tcMar>
+          </w:tcPr>
+          <w:p>
+            <w:pPr>
+              <w:spacing w:after="0"/>
+            </w:pPr>
+            <w:r/>
+            <w:r>
+              <w:rPr>
+                <w:rFonts w:ascii="Calibri" w:hAnsi="Calibri"/>
+                <w:b w:val="0"/>
+                <w:sz w:val="17"/>
+              </w:rPr>
+              <w:t>location.route_time</w:t>
+            </w:r>
+          </w:p>
+        </w:tc>
+        <w:tc>
+          <w:tcPr>
+            <w:tcW w:type="dxa" w:w="1800"/>
+            <w:vAlign w:val="center"/>
+            <w:tcMar>
+              <w:top w:w="100" w:type="dxa"/>
+              <w:bottom w:w="100" w:type="dxa"/>
+              <w:start w:w="100" w:type="dxa"/>
+              <w:end w:w="100" w:type="dxa"/>
+            </w:tcMar>
+          </w:tcPr>
+          <w:p>
+            <w:pPr>
+              <w:spacing w:after="0"/>
+            </w:pPr>
+            <w:r/>
+            <w:r>
+              <w:rPr>
+                <w:rFonts w:ascii="Calibri" w:hAnsi="Calibri"/>
+                <w:b w:val="0"/>
+                <w:sz w:val="17"/>
+              </w:rPr>
+              <w:t>Location</w:t>
+            </w:r>
+          </w:p>
+        </w:tc>
+        <w:tc>
+          <w:tcPr>
+            <w:tcW w:type="dxa" w:w="4176"/>
+            <w:vAlign w:val="center"/>
+            <w:tcMar>
+              <w:top w:w="100" w:type="dxa"/>
+              <w:bottom w:w="100" w:type="dxa"/>
+              <w:start w:w="100" w:type="dxa"/>
+              <w:end w:w="100" w:type="dxa"/>
+            </w:tcMar>
+          </w:tcPr>
+          <w:p>
+            <w:pPr>
+              <w:spacing w:after="0"/>
+            </w:pPr>
+            <w:r/>
+            <w:r>
+              <w:rPr>
+                <w:rFonts w:ascii="Calibri" w:hAnsi="Calibri"/>
+                <w:b w:val="0"/>
+                <w:sz w:val="17"/>
+              </w:rPr>
+              <w:t>POST /v1/location/route-time</w:t>
+            </w:r>
+          </w:p>
+        </w:tc>
+        <w:tc>
+          <w:tcPr>
+            <w:tcW w:type="dxa" w:w="1007"/>
+            <w:vAlign w:val="center"/>
+            <w:tcMar>
+              <w:top w:w="100" w:type="dxa"/>
+              <w:bottom w:w="100" w:type="dxa"/>
+              <w:start w:w="100" w:type="dxa"/>
+              <w:end w:w="100" w:type="dxa"/>
+            </w:tcMar>
+          </w:tcPr>
+          <w:p>
+            <w:pPr>
+              <w:spacing w:after="0"/>
+            </w:pPr>
+            <w:r/>
+            <w:r>
+              <w:rPr>
+                <w:rFonts w:ascii="Calibri" w:hAnsi="Calibri"/>
+                <w:b w:val="0"/>
+                <w:sz w:val="17"/>
+              </w:rPr>
+              <w:t>Read/calculation</w:t>
+            </w:r>
+          </w:p>
+        </w:tc>
+      </w:tr>
+      <w:tr>
+        <w:tc>
+          <w:tcPr>
+            <w:tcW w:type="dxa" w:w="2232"/>
+            <w:vAlign w:val="center"/>
+            <w:tcMar>
+              <w:top w:w="100" w:type="dxa"/>
+              <w:bottom w:w="100" w:type="dxa"/>
+              <w:start w:w="100" w:type="dxa"/>
+              <w:end w:w="100" w:type="dxa"/>
+            </w:tcMar>
+          </w:tcPr>
+          <w:p>
+            <w:pPr>
+              <w:spacing w:after="0"/>
+            </w:pPr>
+            <w:r/>
+            <w:r>
+              <w:rPr>
+                <w:rFonts w:ascii="Calibri" w:hAnsi="Calibri"/>
+                <w:b w:val="0"/>
+                <w:sz w:val="17"/>
+              </w:rPr>
+              <w:t>adviser.get_profile</w:t>
+            </w:r>
+          </w:p>
+        </w:tc>
+        <w:tc>
+          <w:tcPr>
+            <w:tcW w:type="dxa" w:w="1800"/>
+            <w:vAlign w:val="center"/>
+            <w:tcMar>
+              <w:top w:w="100" w:type="dxa"/>
+              <w:bottom w:w="100" w:type="dxa"/>
+              <w:start w:w="100" w:type="dxa"/>
+              <w:end w:w="100" w:type="dxa"/>
+            </w:tcMar>
+          </w:tcPr>
+          <w:p>
+            <w:pPr>
+              <w:spacing w:after="0"/>
+            </w:pPr>
+            <w:r/>
+            <w:r>
+              <w:rPr>
+                <w:rFonts w:ascii="Calibri" w:hAnsi="Calibri"/>
+                <w:b w:val="0"/>
+                <w:sz w:val="17"/>
+              </w:rPr>
+              <w:t>Adviser</w:t>
+            </w:r>
+          </w:p>
+        </w:tc>
+        <w:tc>
+          <w:tcPr>
+            <w:tcW w:type="dxa" w:w="4176"/>
+            <w:vAlign w:val="center"/>
+            <w:tcMar>
+              <w:top w:w="100" w:type="dxa"/>
+              <w:bottom w:w="100" w:type="dxa"/>
+              <w:start w:w="100" w:type="dxa"/>
+              <w:end w:w="100" w:type="dxa"/>
+            </w:tcMar>
+          </w:tcPr>
+          <w:p>
+            <w:pPr>
+              <w:spacing w:after="0"/>
+            </w:pPr>
+            <w:r/>
+            <w:r>
+              <w:rPr>
+                <w:rFonts w:ascii="Calibri" w:hAnsi="Calibri"/>
+                <w:b w:val="0"/>
+                <w:sz w:val="17"/>
+              </w:rPr>
+              <w:t>GET /v1/admin/advisers/{adviserId}</w:t>
+            </w:r>
+          </w:p>
+        </w:tc>
+        <w:tc>
+          <w:tcPr>
+            <w:tcW w:type="dxa" w:w="1007"/>
+            <w:vAlign w:val="center"/>
+            <w:tcMar>
+              <w:top w:w="100" w:type="dxa"/>
+              <w:bottom w:w="100" w:type="dxa"/>
+              <w:start w:w="100" w:type="dxa"/>
+              <w:end w:w="100" w:type="dxa"/>
+            </w:tcMar>
+          </w:tcPr>
+          <w:p>
+            <w:pPr>
+              <w:spacing w:after="0"/>
+            </w:pPr>
+            <w:r/>
+            <w:r>
+              <w:rPr>
+                <w:rFonts w:ascii="Calibri" w:hAnsi="Calibri"/>
+                <w:b w:val="0"/>
+                <w:sz w:val="17"/>
+              </w:rPr>
+              <w:t>Read</w:t>
+            </w:r>
+          </w:p>
+        </w:tc>
+      </w:tr>
+      <w:tr>
+        <w:tc>
+          <w:tcPr>
+            <w:tcW w:type="dxa" w:w="2232"/>
+            <w:vAlign w:val="center"/>
+            <w:tcMar>
+              <w:top w:w="100" w:type="dxa"/>
+              <w:bottom w:w="100" w:type="dxa"/>
+              <w:start w:w="100" w:type="dxa"/>
+              <w:end w:w="100" w:type="dxa"/>
+            </w:tcMar>
+          </w:tcPr>
+          <w:p>
+            <w:pPr>
+              <w:spacing w:after="0"/>
+            </w:pPr>
+            <w:r/>
+            <w:r>
+              <w:rPr>
+                <w:rFonts w:ascii="Calibri" w:hAnsi="Calibri"/>
+                <w:b w:val="0"/>
+                <w:sz w:val="17"/>
+              </w:rPr>
+              <w:t>identity.get_current_user</w:t>
+            </w:r>
+          </w:p>
+        </w:tc>
+        <w:tc>
+          <w:tcPr>
+            <w:tcW w:type="dxa" w:w="1800"/>
+            <w:vAlign w:val="center"/>
+            <w:tcMar>
+              <w:top w:w="100" w:type="dxa"/>
+              <w:bottom w:w="100" w:type="dxa"/>
+              <w:start w:w="100" w:type="dxa"/>
+              <w:end w:w="100" w:type="dxa"/>
+            </w:tcMar>
+          </w:tcPr>
+          <w:p>
+            <w:pPr>
+              <w:spacing w:after="0"/>
+            </w:pPr>
+            <w:r/>
+            <w:r>
+              <w:rPr>
+                <w:rFonts w:ascii="Calibri" w:hAnsi="Calibri"/>
+                <w:b w:val="0"/>
+                <w:sz w:val="17"/>
+              </w:rPr>
+              <w:t>Identity</w:t>
+            </w:r>
+          </w:p>
+        </w:tc>
+        <w:tc>
+          <w:tcPr>
+            <w:tcW w:type="dxa" w:w="4176"/>
+            <w:vAlign w:val="center"/>
+            <w:tcMar>
+              <w:top w:w="100" w:type="dxa"/>
+              <w:bottom w:w="100" w:type="dxa"/>
+              <w:start w:w="100" w:type="dxa"/>
+              <w:end w:w="100" w:type="dxa"/>
+            </w:tcMar>
+          </w:tcPr>
+          <w:p>
+            <w:pPr>
+              <w:spacing w:after="0"/>
+            </w:pPr>
+            <w:r/>
+            <w:r>
+              <w:rPr>
+                <w:rFonts w:ascii="Calibri" w:hAnsi="Calibri"/>
+                <w:b w:val="0"/>
+                <w:sz w:val="17"/>
+              </w:rPr>
+              <w:t>GET /internal/identity/v1/me</w:t>
+            </w:r>
+          </w:p>
+        </w:tc>
+        <w:tc>
+          <w:tcPr>
+            <w:tcW w:type="dxa" w:w="1007"/>
+            <w:vAlign w:val="center"/>
+            <w:tcMar>
+              <w:top w:w="100" w:type="dxa"/>
+              <w:bottom w:w="100" w:type="dxa"/>
+              <w:start w:w="100" w:type="dxa"/>
+              <w:end w:w="100" w:type="dxa"/>
+            </w:tcMar>
+          </w:tcPr>
+          <w:p>
+            <w:pPr>
+              <w:spacing w:after="0"/>
+            </w:pPr>
+            <w:r/>
+            <w:r>
+              <w:rPr>
+                <w:rFonts w:ascii="Calibri" w:hAnsi="Calibri"/>
+                <w:b w:val="0"/>
+                <w:sz w:val="17"/>
+              </w:rPr>
+              <w:t>Read</w:t>
+            </w:r>
+          </w:p>
+        </w:tc>
+      </w:tr>
+      <w:tr>
+        <w:tc>
+          <w:tcPr>
+            <w:tcW w:type="dxa" w:w="2232"/>
+            <w:vAlign w:val="center"/>
+            <w:tcMar>
+              <w:top w:w="100" w:type="dxa"/>
+              <w:bottom w:w="100" w:type="dxa"/>
+              <w:start w:w="100" w:type="dxa"/>
+              <w:end w:w="100" w:type="dxa"/>
+            </w:tcMar>
+          </w:tcPr>
+          <w:p>
+            <w:pPr>
+              <w:spacing w:after="0"/>
+            </w:pPr>
+            <w:r/>
+            <w:r>
+              <w:rPr>
+                <w:rFonts w:ascii="Calibri" w:hAnsi="Calibri"/>
+                <w:b w:val="0"/>
+                <w:sz w:val="17"/>
+              </w:rPr>
+              <w:t>acs.get_transcription</w:t>
+            </w:r>
+          </w:p>
+        </w:tc>
+        <w:tc>
+          <w:tcPr>
+            <w:tcW w:type="dxa" w:w="1800"/>
+            <w:vAlign w:val="center"/>
+            <w:tcMar>
+              <w:top w:w="100" w:type="dxa"/>
+              <w:bottom w:w="100" w:type="dxa"/>
+              <w:start w:w="100" w:type="dxa"/>
+              <w:end w:w="100" w:type="dxa"/>
+            </w:tcMar>
+          </w:tcPr>
+          <w:p>
+            <w:pPr>
+              <w:spacing w:after="0"/>
+            </w:pPr>
+            <w:r/>
+            <w:r>
+              <w:rPr>
+                <w:rFonts w:ascii="Calibri" w:hAnsi="Calibri"/>
+                <w:b w:val="0"/>
+                <w:sz w:val="17"/>
+              </w:rPr>
+              <w:t>ACS</w:t>
+            </w:r>
+          </w:p>
+        </w:tc>
+        <w:tc>
+          <w:tcPr>
+            <w:tcW w:type="dxa" w:w="4176"/>
+            <w:vAlign w:val="center"/>
+            <w:tcMar>
+              <w:top w:w="100" w:type="dxa"/>
+              <w:bottom w:w="100" w:type="dxa"/>
+              <w:start w:w="100" w:type="dxa"/>
+              <w:end w:w="100" w:type="dxa"/>
+            </w:tcMar>
+          </w:tcPr>
+          <w:p>
+            <w:pPr>
+              <w:spacing w:after="0"/>
+            </w:pPr>
+            <w:r/>
+            <w:r>
+              <w:rPr>
+                <w:rFonts w:ascii="Calibri" w:hAnsi="Calibri"/>
+                <w:b w:val="0"/>
+                <w:sz w:val="17"/>
+              </w:rPr>
+              <w:t>GET /v1/transcriptions/{jobId}/content</w:t>
+            </w:r>
+          </w:p>
+        </w:tc>
+        <w:tc>
+          <w:tcPr>
+            <w:tcW w:type="dxa" w:w="1007"/>
+            <w:vAlign w:val="center"/>
+            <w:tcMar>
+              <w:top w:w="100" w:type="dxa"/>
+              <w:bottom w:w="100" w:type="dxa"/>
+              <w:start w:w="100" w:type="dxa"/>
+              <w:end w:w="100" w:type="dxa"/>
+            </w:tcMar>
+          </w:tcPr>
+          <w:p>
+            <w:pPr>
+              <w:spacing w:after="0"/>
+            </w:pPr>
+            <w:r/>
+            <w:r>
+              <w:rPr>
+                <w:rFonts w:ascii="Calibri" w:hAnsi="Calibri"/>
+                <w:b w:val="0"/>
+                <w:sz w:val="17"/>
+              </w:rPr>
+              <w:t>Read</w:t>
+            </w:r>
+          </w:p>
+        </w:tc>
+      </w:tr>
+      <w:tr>
+        <w:tc>
+          <w:tcPr>
+            <w:tcW w:type="dxa" w:w="2232"/>
+            <w:vAlign w:val="center"/>
+            <w:tcMar>
+              <w:top w:w="100" w:type="dxa"/>
+              <w:bottom w:w="100" w:type="dxa"/>
+              <w:start w:w="100" w:type="dxa"/>
+              <w:end w:w="100" w:type="dxa"/>
+            </w:tcMar>
+          </w:tcPr>
+          <w:p>
+            <w:pPr>
+              <w:spacing w:after="0"/>
+            </w:pPr>
+            <w:r/>
+            <w:r>
+              <w:rPr>
+                <w:rFonts w:ascii="Calibri" w:hAnsi="Calibri"/>
+                <w:b w:val="0"/>
+                <w:sz w:val="17"/>
+              </w:rPr>
+              <w:t>client.get_integration_status</w:t>
+            </w:r>
+          </w:p>
+        </w:tc>
+        <w:tc>
+          <w:tcPr>
+            <w:tcW w:type="dxa" w:w="1800"/>
+            <w:vAlign w:val="center"/>
+            <w:tcMar>
+              <w:top w:w="100" w:type="dxa"/>
+              <w:bottom w:w="100" w:type="dxa"/>
+              <w:start w:w="100" w:type="dxa"/>
+              <w:end w:w="100" w:type="dxa"/>
+            </w:tcMar>
+          </w:tcPr>
+          <w:p>
+            <w:pPr>
+              <w:spacing w:after="0"/>
+            </w:pPr>
+            <w:r/>
+            <w:r>
+              <w:rPr>
+                <w:rFonts w:ascii="Calibri" w:hAnsi="Calibri"/>
+                <w:b w:val="0"/>
+                <w:sz w:val="17"/>
+              </w:rPr>
+              <w:t>Client Integration</w:t>
+            </w:r>
+          </w:p>
+        </w:tc>
+        <w:tc>
+          <w:tcPr>
+            <w:tcW w:type="dxa" w:w="4176"/>
+            <w:vAlign w:val="center"/>
+            <w:tcMar>
+              <w:top w:w="100" w:type="dxa"/>
+              <w:bottom w:w="100" w:type="dxa"/>
+              <w:start w:w="100" w:type="dxa"/>
+              <w:end w:w="100" w:type="dxa"/>
+            </w:tcMar>
+          </w:tcPr>
+          <w:p>
+            <w:pPr>
+              <w:spacing w:after="0"/>
+            </w:pPr>
+            <w:r/>
+            <w:r>
+              <w:rPr>
+                <w:rFonts w:ascii="Calibri" w:hAnsi="Calibri"/>
+                <w:b w:val="0"/>
+                <w:sz w:val="17"/>
+              </w:rPr>
+              <w:t>GET /v2/status/{id}</w:t>
+            </w:r>
+          </w:p>
+        </w:tc>
+        <w:tc>
+          <w:tcPr>
+            <w:tcW w:type="dxa" w:w="1007"/>
+            <w:vAlign w:val="center"/>
+            <w:tcMar>
+              <w:top w:w="100" w:type="dxa"/>
+              <w:bottom w:w="100" w:type="dxa"/>
+              <w:start w:w="100" w:type="dxa"/>
+              <w:end w:w="100" w:type="dxa"/>
+            </w:tcMar>
+          </w:tcPr>
+          <w:p>
+            <w:pPr>
+              <w:spacing w:after="0"/>
+            </w:pPr>
+            <w:r/>
+            <w:r>
+              <w:rPr>
+                <w:rFonts w:ascii="Calibri" w:hAnsi="Calibri"/>
+                <w:b w:val="0"/>
+                <w:sz w:val="17"/>
+              </w:rPr>
+              <w:t>Read</w:t>
+            </w:r>
+          </w:p>
+        </w:tc>
+      </w:tr>
+      <w:tr>
+        <w:tc>
+          <w:tcPr>
+            <w:tcW w:type="dxa" w:w="2232"/>
+            <w:vAlign w:val="center"/>
+            <w:tcMar>
+              <w:top w:w="100" w:type="dxa"/>
+              <w:bottom w:w="100" w:type="dxa"/>
+              <w:start w:w="100" w:type="dxa"/>
+              <w:end w:w="100" w:type="dxa"/>
+            </w:tcMar>
+          </w:tcPr>
+          <w:p>
+            <w:pPr>
+              <w:spacing w:after="0"/>
+            </w:pPr>
+            <w:r/>
+            <w:r>
+              <w:rPr>
+                <w:rFonts w:ascii="Calibri" w:hAnsi="Calibri"/>
+                <w:b w:val="0"/>
+                <w:sz w:val="17"/>
+              </w:rPr>
+              <w:t>devops.create_user_story</w:t>
+            </w:r>
+          </w:p>
+        </w:tc>
+        <w:tc>
+          <w:tcPr>
+            <w:tcW w:type="dxa" w:w="1800"/>
+            <w:vAlign w:val="center"/>
+            <w:tcMar>
+              <w:top w:w="100" w:type="dxa"/>
+              <w:bottom w:w="100" w:type="dxa"/>
+              <w:start w:w="100" w:type="dxa"/>
+              <w:end w:w="100" w:type="dxa"/>
+            </w:tcMar>
+          </w:tcPr>
+          <w:p>
+            <w:pPr>
+              <w:spacing w:after="0"/>
+            </w:pPr>
+            <w:r/>
+            <w:r>
+              <w:rPr>
+                <w:rFonts w:ascii="Calibri" w:hAnsi="Calibri"/>
+                <w:b w:val="0"/>
+                <w:sz w:val="17"/>
+              </w:rPr>
+              <w:t>DevOps Integration</w:t>
+            </w:r>
+          </w:p>
+        </w:tc>
+        <w:tc>
+          <w:tcPr>
+            <w:tcW w:type="dxa" w:w="4176"/>
+            <w:vAlign w:val="center"/>
+            <w:tcMar>
+              <w:top w:w="100" w:type="dxa"/>
+              <w:bottom w:w="100" w:type="dxa"/>
+              <w:start w:w="100" w:type="dxa"/>
+              <w:end w:w="100" w:type="dxa"/>
+            </w:tcMar>
+          </w:tcPr>
+          <w:p>
+            <w:pPr>
+              <w:spacing w:after="0"/>
+            </w:pPr>
+            <w:r/>
+            <w:r>
+              <w:rPr>
+                <w:rFonts w:ascii="Calibri" w:hAnsi="Calibri"/>
+                <w:b w:val="0"/>
+                <w:sz w:val="17"/>
+              </w:rPr>
+              <w:t>POST /internal/devops/v1/work-items/user-stories</w:t>
+            </w:r>
+          </w:p>
+        </w:tc>
+        <w:tc>
+          <w:tcPr>
+            <w:tcW w:type="dxa" w:w="1007"/>
+            <w:vAlign w:val="center"/>
+            <w:tcMar>
+              <w:top w:w="100" w:type="dxa"/>
+              <w:bottom w:w="100" w:type="dxa"/>
+              <w:start w:w="100" w:type="dxa"/>
+              <w:end w:w="100" w:type="dxa"/>
+            </w:tcMar>
+          </w:tcPr>
+          <w:p>
+            <w:pPr>
+              <w:spacing w:after="0"/>
+            </w:pPr>
+            <w:r/>
+            <w:r>
+              <w:rPr>
+                <w:rFonts w:ascii="Calibri" w:hAnsi="Calibri"/>
+                <w:b w:val="0"/>
+                <w:sz w:val="17"/>
+              </w:rPr>
+              <w:t>Write; approval/idempotency proposed</w:t>
+            </w:r>
+          </w:p>
+        </w:tc>
+      </w:tr>
+      <w:tr>
+        <w:tc>
+          <w:tcPr>
+            <w:tcW w:type="dxa" w:w="2232"/>
+            <w:vAlign w:val="center"/>
+            <w:tcMar>
+              <w:top w:w="100" w:type="dxa"/>
+              <w:bottom w:w="100" w:type="dxa"/>
+              <w:start w:w="100" w:type="dxa"/>
+              <w:end w:w="100" w:type="dxa"/>
+            </w:tcMar>
+          </w:tcPr>
+          <w:p>
+            <w:pPr>
+              <w:spacing w:after="0"/>
+            </w:pPr>
+            <w:r/>
+            <w:r>
+              <w:rPr>
+                <w:rFonts w:ascii="Calibri" w:hAnsi="Calibri"/>
+                <w:b w:val="0"/>
+                <w:sz w:val="17"/>
+              </w:rPr>
+              <w:t>devops.link_pull_request</w:t>
+            </w:r>
+          </w:p>
+        </w:tc>
+        <w:tc>
+          <w:tcPr>
+            <w:tcW w:type="dxa" w:w="1800"/>
+            <w:vAlign w:val="center"/>
+            <w:tcMar>
+              <w:top w:w="100" w:type="dxa"/>
+              <w:bottom w:w="100" w:type="dxa"/>
+              <w:start w:w="100" w:type="dxa"/>
+              <w:end w:w="100" w:type="dxa"/>
+            </w:tcMar>
+          </w:tcPr>
+          <w:p>
+            <w:pPr>
+              <w:spacing w:after="0"/>
+            </w:pPr>
+            <w:r/>
+            <w:r>
+              <w:rPr>
+                <w:rFonts w:ascii="Calibri" w:hAnsi="Calibri"/>
+                <w:b w:val="0"/>
+                <w:sz w:val="17"/>
+              </w:rPr>
+              <w:t>DevOps Integration</w:t>
+            </w:r>
+          </w:p>
+        </w:tc>
+        <w:tc>
+          <w:tcPr>
+            <w:tcW w:type="dxa" w:w="4176"/>
+            <w:vAlign w:val="center"/>
+            <w:tcMar>
+              <w:top w:w="100" w:type="dxa"/>
+              <w:bottom w:w="100" w:type="dxa"/>
+              <w:start w:w="100" w:type="dxa"/>
+              <w:end w:w="100" w:type="dxa"/>
+            </w:tcMar>
+          </w:tcPr>
+          <w:p>
+            <w:pPr>
+              <w:spacing w:after="0"/>
+            </w:pPr>
+            <w:r/>
+            <w:r>
+              <w:rPr>
+                <w:rFonts w:ascii="Calibri" w:hAnsi="Calibri"/>
+                <w:b w:val="0"/>
+                <w:sz w:val="17"/>
+              </w:rPr>
+              <w:t>POST /internal/devops/v1/pull-requests/link</w:t>
+            </w:r>
+          </w:p>
+        </w:tc>
+        <w:tc>
+          <w:tcPr>
+            <w:tcW w:type="dxa" w:w="1007"/>
+            <w:vAlign w:val="center"/>
+            <w:tcMar>
+              <w:top w:w="100" w:type="dxa"/>
+              <w:bottom w:w="100" w:type="dxa"/>
+              <w:start w:w="100" w:type="dxa"/>
+              <w:end w:w="100" w:type="dxa"/>
+            </w:tcMar>
+          </w:tcPr>
+          <w:p>
+            <w:pPr>
+              <w:spacing w:after="0"/>
+            </w:pPr>
+            <w:r/>
+            <w:r>
+              <w:rPr>
+                <w:rFonts w:ascii="Calibri" w:hAnsi="Calibri"/>
+                <w:b w:val="0"/>
+                <w:sz w:val="17"/>
+              </w:rPr>
+              <w:t>Write</w:t>
+            </w:r>
+          </w:p>
+        </w:tc>
+      </w:tr>
+    </w:tbl>
+    <w:p>
+      <w:pPr>
+        <w:spacing w:after="60"/>
+      </w:pPr>
+    </w:p>
+    <w:p>
+      <w:pPr>
+        <w:pStyle w:val="Heading2"/>
+      </w:pPr>
+      <w:r>
+        <w:t>6.2 Example tool provider manifest</w:t>
+      </w:r>
+    </w:p>
+    <w:p>
+      <w:r>
+        <w:rPr>
+          <w:rFonts w:ascii="Consolas" w:hAnsi="Consolas"/>
+          <w:sz w:val="17"/>
+        </w:rPr>
+        <w:t>{</w:t>
+        <w:br/>
+        <w:t xml:space="preserve">  "provider": "afh-booking-function-app",</w:t>
+        <w:br/>
+        <w:t xml:space="preserve">  "version": "1.0",</w:t>
+        <w:br/>
+        <w:t xml:space="preserve">  "tools": [</w:t>
+        <w:br/>
+        <w:t xml:space="preserve">    {</w:t>
+        <w:br/>
+        <w:t xml:space="preserve">      "name": "booking.get_lifecycle",</w:t>
+        <w:br/>
+        <w:t xml:space="preserve">      "description": "Return booking lifecycle events for an existing booking.",</w:t>
+        <w:br/>
+        <w:t xml:space="preserve">      "permission": "booking.lifecycle.read",</w:t>
+        <w:br/>
+        <w:t xml:space="preserve">      "sideEffect": "read",</w:t>
+        <w:br/>
+        <w:t xml:space="preserve">      "endpoint": { "method": "GET", "path": "/v1/bookings/{bookingId}/lifecycle" },</w:t>
+        <w:br/>
+        <w:t xml:space="preserve">      "inputSchema": { "bookingId": "string" },</w:t>
+        <w:br/>
+        <w:t xml:space="preserve">      "approvalRequired": false</w:t>
+        <w:br/>
+        <w:t xml:space="preserve">    }</w:t>
+        <w:br/>
+        <w:t xml:space="preserve">  ]</w:t>
+        <w:br/>
+        <w:t>}</w:t>
+        <w:br/>
+      </w:r>
     </w:p>
     <w:p>
       <w:pPr>
@@ -3507,7 +6191,7 @@
                 <w:color w:val="12202F"/>
                 <w:sz w:val="20"/>
               </w:rPr>
-              <w:t>If a workflow needs durable state, retries, idempotency, approvals, scheduling, or domain-specific decisions, it should not live in the MCP Gateway.</w:t>
+              <w:t>A practical boundary is to place workflows with durable state, retries, idempotency, approvals, scheduling, or domain-specific decisions outside the MCP Gateway.</w:t>
             </w:r>
           </w:p>
         </w:tc>
@@ -3523,12 +6207,12 @@
         <w:pStyle w:val="Heading1"/>
       </w:pPr>
       <w:r>
-        <w:t>9. DevOps integration recommendation</w:t>
+        <w:t>9. DevOps integration proposal</w:t>
       </w:r>
     </w:p>
     <w:p>
       <w:r>
-        <w:t>Azure DevOps automation should be implemented as a dedicated DevOps Integration Service under /services and exposed by the MCP Gateway as devops.* tools. This keeps Azure DevOps auth, work item templates, sprint reads, pull request linking, idempotency, and workflow audit in one owned service.</w:t>
+        <w:t>This proposal places Azure DevOps automation in a dedicated DevOps Integration Service under /services, exposed by the MCP Gateway as devops.* tools. This is intentionally a service/function app rather than an SDK because Azure DevOps credentials, managed identities, Key Vault access, token refresh, approval state, idempotency, and workflow audit need a deployable runtime boundary.</w:t>
       </w:r>
     </w:p>
     <w:p>
@@ -3537,7 +6221,7 @@
         <w:spacing w:after="80"/>
       </w:pPr>
       <w:r>
-        <w:t>The MCP Gateway should expose devops.* tools and enforce AI policy.</w:t>
+        <w:t>The MCP Gateway exposes devops.* tools and applies AI policy.</w:t>
       </w:r>
     </w:p>
     <w:p>
@@ -3546,7 +6230,7 @@
         <w:spacing w:after="80"/>
       </w:pPr>
       <w:r>
-        <w:t>AFH.DevOps.Integration.Application should own workflows such as create epic, create feature, create user story, create task, update work item, link pull request, read sprint, and generate implementation plan.</w:t>
+        <w:t>AFH.DevOps.Integration.Application owns workflows such as create epic, create feature, create user story, create task, update work item, link pull request, read sprint, and generate implementation plan.</w:t>
       </w:r>
     </w:p>
     <w:p>
@@ -3555,7 +6239,7 @@
         <w:spacing w:after="80"/>
       </w:pPr>
       <w:r>
-        <w:t>AFH.DevOps.Integration.Infrastructure should contain Azure DevOps REST clients, auth, retries, and DTO mapping.</w:t>
+        <w:t>AFH.DevOps.Integration.Infrastructure contains Azure DevOps REST clients, auth, retries, and DTO mapping.</w:t>
       </w:r>
     </w:p>
     <w:p>
@@ -3564,8 +6248,762 @@
         <w:spacing w:after="80"/>
       </w:pPr>
       <w:r>
-        <w:t>A shared afh-common-devops SDK should contain reusable client primitives, not workflow business logic.</w:t>
+        <w:t>Azure DevOps secrets stay in the DevOps Integration Function App configuration or Key Vault references, not in shared SDK packages.</w:t>
       </w:r>
+    </w:p>
+    <w:p>
+      <w:pPr>
+        <w:pStyle w:val="ListBullet"/>
+        <w:spacing w:after="80"/>
+      </w:pPr>
+      <w:r>
+        <w:t>If shared contracts are useful, keep them in AFH.DevOps.Integration.Contract or a thin contract package with no secrets, no token acquisition, and no workflow execution.</w:t>
+      </w:r>
+    </w:p>
+    <w:tbl>
+      <w:tblPr>
+        <w:tblStyle w:val="TableGrid"/>
+        <w:tblW w:type="auto" w:w="0"/>
+        <w:jc w:val="center"/>
+        <w:tblLayout w:type="fixed"/>
+        <w:tblLook w:firstColumn="1" w:firstRow="1" w:lastColumn="0" w:lastRow="0" w:noHBand="0" w:noVBand="1" w:val="04A0"/>
+      </w:tblPr>
+      <w:tblGrid>
+        <w:gridCol w:w="3120"/>
+        <w:gridCol w:w="3120"/>
+        <w:gridCol w:w="3120"/>
+      </w:tblGrid>
+      <w:tr>
+        <w:tc>
+          <w:tcPr>
+            <w:tcW w:type="dxa" w:w="2232"/>
+            <w:shd w:fill="E8EEF5"/>
+            <w:vAlign w:val="center"/>
+            <w:tcMar>
+              <w:top w:w="100" w:type="dxa"/>
+              <w:bottom w:w="100" w:type="dxa"/>
+              <w:start w:w="100" w:type="dxa"/>
+              <w:end w:w="100" w:type="dxa"/>
+            </w:tcMar>
+          </w:tcPr>
+          <w:p>
+            <w:pPr>
+              <w:spacing w:after="0"/>
+            </w:pPr>
+            <w:r/>
+            <w:r>
+              <w:rPr>
+                <w:rFonts w:ascii="Calibri" w:hAnsi="Calibri"/>
+                <w:b/>
+                <w:color w:val="12202F"/>
+                <w:sz w:val="18"/>
+              </w:rPr>
+              <w:t>DevOps capability</w:t>
+            </w:r>
+          </w:p>
+        </w:tc>
+        <w:tc>
+          <w:tcPr>
+            <w:tcW w:type="dxa" w:w="3816"/>
+            <w:shd w:fill="E8EEF5"/>
+            <w:vAlign w:val="center"/>
+            <w:tcMar>
+              <w:top w:w="100" w:type="dxa"/>
+              <w:bottom w:w="100" w:type="dxa"/>
+              <w:start w:w="100" w:type="dxa"/>
+              <w:end w:w="100" w:type="dxa"/>
+            </w:tcMar>
+          </w:tcPr>
+          <w:p>
+            <w:pPr>
+              <w:spacing w:after="0"/>
+            </w:pPr>
+            <w:r/>
+            <w:r>
+              <w:rPr>
+                <w:rFonts w:ascii="Calibri" w:hAnsi="Calibri"/>
+                <w:b/>
+                <w:color w:val="12202F"/>
+                <w:sz w:val="18"/>
+              </w:rPr>
+              <w:t>Example endpoint in DevOps Integration Service</w:t>
+            </w:r>
+          </w:p>
+        </w:tc>
+        <w:tc>
+          <w:tcPr>
+            <w:tcW w:type="dxa" w:w="3168"/>
+            <w:shd w:fill="E8EEF5"/>
+            <w:vAlign w:val="center"/>
+            <w:tcMar>
+              <w:top w:w="100" w:type="dxa"/>
+              <w:bottom w:w="100" w:type="dxa"/>
+              <w:start w:w="100" w:type="dxa"/>
+              <w:end w:w="100" w:type="dxa"/>
+            </w:tcMar>
+          </w:tcPr>
+          <w:p>
+            <w:pPr>
+              <w:spacing w:after="0"/>
+            </w:pPr>
+            <w:r/>
+            <w:r>
+              <w:rPr>
+                <w:rFonts w:ascii="Calibri" w:hAnsi="Calibri"/>
+                <w:b/>
+                <w:color w:val="12202F"/>
+                <w:sz w:val="18"/>
+              </w:rPr>
+              <w:t>Notes</w:t>
+            </w:r>
+          </w:p>
+        </w:tc>
+      </w:tr>
+      <w:tr>
+        <w:tc>
+          <w:tcPr>
+            <w:tcW w:type="dxa" w:w="2232"/>
+            <w:vAlign w:val="center"/>
+            <w:tcMar>
+              <w:top w:w="100" w:type="dxa"/>
+              <w:bottom w:w="100" w:type="dxa"/>
+              <w:start w:w="100" w:type="dxa"/>
+              <w:end w:w="100" w:type="dxa"/>
+            </w:tcMar>
+          </w:tcPr>
+          <w:p>
+            <w:pPr>
+              <w:spacing w:after="0"/>
+            </w:pPr>
+            <w:r/>
+            <w:r>
+              <w:rPr>
+                <w:rFonts w:ascii="Calibri" w:hAnsi="Calibri"/>
+                <w:b w:val="0"/>
+                <w:sz w:val="17"/>
+              </w:rPr>
+              <w:t>Create Epic</w:t>
+            </w:r>
+          </w:p>
+        </w:tc>
+        <w:tc>
+          <w:tcPr>
+            <w:tcW w:type="dxa" w:w="3816"/>
+            <w:vAlign w:val="center"/>
+            <w:tcMar>
+              <w:top w:w="100" w:type="dxa"/>
+              <w:bottom w:w="100" w:type="dxa"/>
+              <w:start w:w="100" w:type="dxa"/>
+              <w:end w:w="100" w:type="dxa"/>
+            </w:tcMar>
+          </w:tcPr>
+          <w:p>
+            <w:pPr>
+              <w:spacing w:after="0"/>
+            </w:pPr>
+            <w:r/>
+            <w:r>
+              <w:rPr>
+                <w:rFonts w:ascii="Calibri" w:hAnsi="Calibri"/>
+                <w:b w:val="0"/>
+                <w:sz w:val="17"/>
+              </w:rPr>
+              <w:t>POST /internal/devops/v1/work-items/epics</w:t>
+            </w:r>
+          </w:p>
+        </w:tc>
+        <w:tc>
+          <w:tcPr>
+            <w:tcW w:type="dxa" w:w="3168"/>
+            <w:vAlign w:val="center"/>
+            <w:tcMar>
+              <w:top w:w="100" w:type="dxa"/>
+              <w:bottom w:w="100" w:type="dxa"/>
+              <w:start w:w="100" w:type="dxa"/>
+              <w:end w:w="100" w:type="dxa"/>
+            </w:tcMar>
+          </w:tcPr>
+          <w:p>
+            <w:pPr>
+              <w:spacing w:after="0"/>
+            </w:pPr>
+            <w:r/>
+            <w:r>
+              <w:rPr>
+                <w:rFonts w:ascii="Calibri" w:hAnsi="Calibri"/>
+                <w:b w:val="0"/>
+                <w:sz w:val="17"/>
+              </w:rPr>
+              <w:t>Creates one Epic from structured input or extracted requirements.</w:t>
+            </w:r>
+          </w:p>
+        </w:tc>
+      </w:tr>
+      <w:tr>
+        <w:tc>
+          <w:tcPr>
+            <w:tcW w:type="dxa" w:w="2232"/>
+            <w:vAlign w:val="center"/>
+            <w:tcMar>
+              <w:top w:w="100" w:type="dxa"/>
+              <w:bottom w:w="100" w:type="dxa"/>
+              <w:start w:w="100" w:type="dxa"/>
+              <w:end w:w="100" w:type="dxa"/>
+            </w:tcMar>
+          </w:tcPr>
+          <w:p>
+            <w:pPr>
+              <w:spacing w:after="0"/>
+            </w:pPr>
+            <w:r/>
+            <w:r>
+              <w:rPr>
+                <w:rFonts w:ascii="Calibri" w:hAnsi="Calibri"/>
+                <w:b w:val="0"/>
+                <w:sz w:val="17"/>
+              </w:rPr>
+              <w:t>Create Feature</w:t>
+            </w:r>
+          </w:p>
+        </w:tc>
+        <w:tc>
+          <w:tcPr>
+            <w:tcW w:type="dxa" w:w="3816"/>
+            <w:vAlign w:val="center"/>
+            <w:tcMar>
+              <w:top w:w="100" w:type="dxa"/>
+              <w:bottom w:w="100" w:type="dxa"/>
+              <w:start w:w="100" w:type="dxa"/>
+              <w:end w:w="100" w:type="dxa"/>
+            </w:tcMar>
+          </w:tcPr>
+          <w:p>
+            <w:pPr>
+              <w:spacing w:after="0"/>
+            </w:pPr>
+            <w:r/>
+            <w:r>
+              <w:rPr>
+                <w:rFonts w:ascii="Calibri" w:hAnsi="Calibri"/>
+                <w:b w:val="0"/>
+                <w:sz w:val="17"/>
+              </w:rPr>
+              <w:t>POST /internal/devops/v1/work-items/features</w:t>
+            </w:r>
+          </w:p>
+        </w:tc>
+        <w:tc>
+          <w:tcPr>
+            <w:tcW w:type="dxa" w:w="3168"/>
+            <w:vAlign w:val="center"/>
+            <w:tcMar>
+              <w:top w:w="100" w:type="dxa"/>
+              <w:bottom w:w="100" w:type="dxa"/>
+              <w:start w:w="100" w:type="dxa"/>
+              <w:end w:w="100" w:type="dxa"/>
+            </w:tcMar>
+          </w:tcPr>
+          <w:p>
+            <w:pPr>
+              <w:spacing w:after="0"/>
+            </w:pPr>
+            <w:r/>
+            <w:r>
+              <w:rPr>
+                <w:rFonts w:ascii="Calibri" w:hAnsi="Calibri"/>
+                <w:b w:val="0"/>
+                <w:sz w:val="17"/>
+              </w:rPr>
+              <w:t>Can optionally link to an Epic.</w:t>
+            </w:r>
+          </w:p>
+        </w:tc>
+      </w:tr>
+      <w:tr>
+        <w:tc>
+          <w:tcPr>
+            <w:tcW w:type="dxa" w:w="2232"/>
+            <w:vAlign w:val="center"/>
+            <w:tcMar>
+              <w:top w:w="100" w:type="dxa"/>
+              <w:bottom w:w="100" w:type="dxa"/>
+              <w:start w:w="100" w:type="dxa"/>
+              <w:end w:w="100" w:type="dxa"/>
+            </w:tcMar>
+          </w:tcPr>
+          <w:p>
+            <w:pPr>
+              <w:spacing w:after="0"/>
+            </w:pPr>
+            <w:r/>
+            <w:r>
+              <w:rPr>
+                <w:rFonts w:ascii="Calibri" w:hAnsi="Calibri"/>
+                <w:b w:val="0"/>
+                <w:sz w:val="17"/>
+              </w:rPr>
+              <w:t>Create User Story</w:t>
+            </w:r>
+          </w:p>
+        </w:tc>
+        <w:tc>
+          <w:tcPr>
+            <w:tcW w:type="dxa" w:w="3816"/>
+            <w:vAlign w:val="center"/>
+            <w:tcMar>
+              <w:top w:w="100" w:type="dxa"/>
+              <w:bottom w:w="100" w:type="dxa"/>
+              <w:start w:w="100" w:type="dxa"/>
+              <w:end w:w="100" w:type="dxa"/>
+            </w:tcMar>
+          </w:tcPr>
+          <w:p>
+            <w:pPr>
+              <w:spacing w:after="0"/>
+            </w:pPr>
+            <w:r/>
+            <w:r>
+              <w:rPr>
+                <w:rFonts w:ascii="Calibri" w:hAnsi="Calibri"/>
+                <w:b w:val="0"/>
+                <w:sz w:val="17"/>
+              </w:rPr>
+              <w:t>POST /internal/devops/v1/work-items/user-stories</w:t>
+            </w:r>
+          </w:p>
+        </w:tc>
+        <w:tc>
+          <w:tcPr>
+            <w:tcW w:type="dxa" w:w="3168"/>
+            <w:vAlign w:val="center"/>
+            <w:tcMar>
+              <w:top w:w="100" w:type="dxa"/>
+              <w:bottom w:w="100" w:type="dxa"/>
+              <w:start w:w="100" w:type="dxa"/>
+              <w:end w:w="100" w:type="dxa"/>
+            </w:tcMar>
+          </w:tcPr>
+          <w:p>
+            <w:pPr>
+              <w:spacing w:after="0"/>
+            </w:pPr>
+            <w:r/>
+            <w:r>
+              <w:rPr>
+                <w:rFonts w:ascii="Calibri" w:hAnsi="Calibri"/>
+                <w:b w:val="0"/>
+                <w:sz w:val="17"/>
+              </w:rPr>
+              <w:t>Supports acceptance criteria and parent Feature link.</w:t>
+            </w:r>
+          </w:p>
+        </w:tc>
+      </w:tr>
+      <w:tr>
+        <w:tc>
+          <w:tcPr>
+            <w:tcW w:type="dxa" w:w="2232"/>
+            <w:vAlign w:val="center"/>
+            <w:tcMar>
+              <w:top w:w="100" w:type="dxa"/>
+              <w:bottom w:w="100" w:type="dxa"/>
+              <w:start w:w="100" w:type="dxa"/>
+              <w:end w:w="100" w:type="dxa"/>
+            </w:tcMar>
+          </w:tcPr>
+          <w:p>
+            <w:pPr>
+              <w:spacing w:after="0"/>
+            </w:pPr>
+            <w:r/>
+            <w:r>
+              <w:rPr>
+                <w:rFonts w:ascii="Calibri" w:hAnsi="Calibri"/>
+                <w:b w:val="0"/>
+                <w:sz w:val="17"/>
+              </w:rPr>
+              <w:t>Create Task</w:t>
+            </w:r>
+          </w:p>
+        </w:tc>
+        <w:tc>
+          <w:tcPr>
+            <w:tcW w:type="dxa" w:w="3816"/>
+            <w:vAlign w:val="center"/>
+            <w:tcMar>
+              <w:top w:w="100" w:type="dxa"/>
+              <w:bottom w:w="100" w:type="dxa"/>
+              <w:start w:w="100" w:type="dxa"/>
+              <w:end w:w="100" w:type="dxa"/>
+            </w:tcMar>
+          </w:tcPr>
+          <w:p>
+            <w:pPr>
+              <w:spacing w:after="0"/>
+            </w:pPr>
+            <w:r/>
+            <w:r>
+              <w:rPr>
+                <w:rFonts w:ascii="Calibri" w:hAnsi="Calibri"/>
+                <w:b w:val="0"/>
+                <w:sz w:val="17"/>
+              </w:rPr>
+              <w:t>POST /internal/devops/v1/work-items/tasks</w:t>
+            </w:r>
+          </w:p>
+        </w:tc>
+        <w:tc>
+          <w:tcPr>
+            <w:tcW w:type="dxa" w:w="3168"/>
+            <w:vAlign w:val="center"/>
+            <w:tcMar>
+              <w:top w:w="100" w:type="dxa"/>
+              <w:bottom w:w="100" w:type="dxa"/>
+              <w:start w:w="100" w:type="dxa"/>
+              <w:end w:w="100" w:type="dxa"/>
+            </w:tcMar>
+          </w:tcPr>
+          <w:p>
+            <w:pPr>
+              <w:spacing w:after="0"/>
+            </w:pPr>
+            <w:r/>
+            <w:r>
+              <w:rPr>
+                <w:rFonts w:ascii="Calibri" w:hAnsi="Calibri"/>
+                <w:b w:val="0"/>
+                <w:sz w:val="17"/>
+              </w:rPr>
+              <w:t>Supports parent User Story link and area/iteration path.</w:t>
+            </w:r>
+          </w:p>
+        </w:tc>
+      </w:tr>
+      <w:tr>
+        <w:tc>
+          <w:tcPr>
+            <w:tcW w:type="dxa" w:w="2232"/>
+            <w:vAlign w:val="center"/>
+            <w:tcMar>
+              <w:top w:w="100" w:type="dxa"/>
+              <w:bottom w:w="100" w:type="dxa"/>
+              <w:start w:w="100" w:type="dxa"/>
+              <w:end w:w="100" w:type="dxa"/>
+            </w:tcMar>
+          </w:tcPr>
+          <w:p>
+            <w:pPr>
+              <w:spacing w:after="0"/>
+            </w:pPr>
+            <w:r/>
+            <w:r>
+              <w:rPr>
+                <w:rFonts w:ascii="Calibri" w:hAnsi="Calibri"/>
+                <w:b w:val="0"/>
+                <w:sz w:val="17"/>
+              </w:rPr>
+              <w:t>Update Work Item</w:t>
+            </w:r>
+          </w:p>
+        </w:tc>
+        <w:tc>
+          <w:tcPr>
+            <w:tcW w:type="dxa" w:w="3816"/>
+            <w:vAlign w:val="center"/>
+            <w:tcMar>
+              <w:top w:w="100" w:type="dxa"/>
+              <w:bottom w:w="100" w:type="dxa"/>
+              <w:start w:w="100" w:type="dxa"/>
+              <w:end w:w="100" w:type="dxa"/>
+            </w:tcMar>
+          </w:tcPr>
+          <w:p>
+            <w:pPr>
+              <w:spacing w:after="0"/>
+            </w:pPr>
+            <w:r/>
+            <w:r>
+              <w:rPr>
+                <w:rFonts w:ascii="Calibri" w:hAnsi="Calibri"/>
+                <w:b w:val="0"/>
+                <w:sz w:val="17"/>
+              </w:rPr>
+              <w:t>PATCH /internal/devops/v1/work-items/{id}</w:t>
+            </w:r>
+          </w:p>
+        </w:tc>
+        <w:tc>
+          <w:tcPr>
+            <w:tcW w:type="dxa" w:w="3168"/>
+            <w:vAlign w:val="center"/>
+            <w:tcMar>
+              <w:top w:w="100" w:type="dxa"/>
+              <w:bottom w:w="100" w:type="dxa"/>
+              <w:start w:w="100" w:type="dxa"/>
+              <w:end w:w="100" w:type="dxa"/>
+            </w:tcMar>
+          </w:tcPr>
+          <w:p>
+            <w:pPr>
+              <w:spacing w:after="0"/>
+            </w:pPr>
+            <w:r/>
+            <w:r>
+              <w:rPr>
+                <w:rFonts w:ascii="Calibri" w:hAnsi="Calibri"/>
+                <w:b w:val="0"/>
+                <w:sz w:val="17"/>
+              </w:rPr>
+              <w:t>Uses Azure DevOps patch document internally.</w:t>
+            </w:r>
+          </w:p>
+        </w:tc>
+      </w:tr>
+      <w:tr>
+        <w:tc>
+          <w:tcPr>
+            <w:tcW w:type="dxa" w:w="2232"/>
+            <w:vAlign w:val="center"/>
+            <w:tcMar>
+              <w:top w:w="100" w:type="dxa"/>
+              <w:bottom w:w="100" w:type="dxa"/>
+              <w:start w:w="100" w:type="dxa"/>
+              <w:end w:w="100" w:type="dxa"/>
+            </w:tcMar>
+          </w:tcPr>
+          <w:p>
+            <w:pPr>
+              <w:spacing w:after="0"/>
+            </w:pPr>
+            <w:r/>
+            <w:r>
+              <w:rPr>
+                <w:rFonts w:ascii="Calibri" w:hAnsi="Calibri"/>
+                <w:b w:val="0"/>
+                <w:sz w:val="17"/>
+              </w:rPr>
+              <w:t>Link Pull Request</w:t>
+            </w:r>
+          </w:p>
+        </w:tc>
+        <w:tc>
+          <w:tcPr>
+            <w:tcW w:type="dxa" w:w="3816"/>
+            <w:vAlign w:val="center"/>
+            <w:tcMar>
+              <w:top w:w="100" w:type="dxa"/>
+              <w:bottom w:w="100" w:type="dxa"/>
+              <w:start w:w="100" w:type="dxa"/>
+              <w:end w:w="100" w:type="dxa"/>
+            </w:tcMar>
+          </w:tcPr>
+          <w:p>
+            <w:pPr>
+              <w:spacing w:after="0"/>
+            </w:pPr>
+            <w:r/>
+            <w:r>
+              <w:rPr>
+                <w:rFonts w:ascii="Calibri" w:hAnsi="Calibri"/>
+                <w:b w:val="0"/>
+                <w:sz w:val="17"/>
+              </w:rPr>
+              <w:t>POST /internal/devops/v1/pull-requests/link</w:t>
+            </w:r>
+          </w:p>
+        </w:tc>
+        <w:tc>
+          <w:tcPr>
+            <w:tcW w:type="dxa" w:w="3168"/>
+            <w:vAlign w:val="center"/>
+            <w:tcMar>
+              <w:top w:w="100" w:type="dxa"/>
+              <w:bottom w:w="100" w:type="dxa"/>
+              <w:start w:w="100" w:type="dxa"/>
+              <w:end w:w="100" w:type="dxa"/>
+            </w:tcMar>
+          </w:tcPr>
+          <w:p>
+            <w:pPr>
+              <w:spacing w:after="0"/>
+            </w:pPr>
+            <w:r/>
+            <w:r>
+              <w:rPr>
+                <w:rFonts w:ascii="Calibri" w:hAnsi="Calibri"/>
+                <w:b w:val="0"/>
+                <w:sz w:val="17"/>
+              </w:rPr>
+              <w:t>Links repository/PR metadata to work items.</w:t>
+            </w:r>
+          </w:p>
+        </w:tc>
+      </w:tr>
+      <w:tr>
+        <w:tc>
+          <w:tcPr>
+            <w:tcW w:type="dxa" w:w="2232"/>
+            <w:vAlign w:val="center"/>
+            <w:tcMar>
+              <w:top w:w="100" w:type="dxa"/>
+              <w:bottom w:w="100" w:type="dxa"/>
+              <w:start w:w="100" w:type="dxa"/>
+              <w:end w:w="100" w:type="dxa"/>
+            </w:tcMar>
+          </w:tcPr>
+          <w:p>
+            <w:pPr>
+              <w:spacing w:after="0"/>
+            </w:pPr>
+            <w:r/>
+            <w:r>
+              <w:rPr>
+                <w:rFonts w:ascii="Calibri" w:hAnsi="Calibri"/>
+                <w:b w:val="0"/>
+                <w:sz w:val="17"/>
+              </w:rPr>
+              <w:t>Read Sprint</w:t>
+            </w:r>
+          </w:p>
+        </w:tc>
+        <w:tc>
+          <w:tcPr>
+            <w:tcW w:type="dxa" w:w="3816"/>
+            <w:vAlign w:val="center"/>
+            <w:tcMar>
+              <w:top w:w="100" w:type="dxa"/>
+              <w:bottom w:w="100" w:type="dxa"/>
+              <w:start w:w="100" w:type="dxa"/>
+              <w:end w:w="100" w:type="dxa"/>
+            </w:tcMar>
+          </w:tcPr>
+          <w:p>
+            <w:pPr>
+              <w:spacing w:after="0"/>
+            </w:pPr>
+            <w:r/>
+            <w:r>
+              <w:rPr>
+                <w:rFonts w:ascii="Calibri" w:hAnsi="Calibri"/>
+                <w:b w:val="0"/>
+                <w:sz w:val="17"/>
+              </w:rPr>
+              <w:t>GET /internal/devops/v1/sprints/current</w:t>
+            </w:r>
+          </w:p>
+        </w:tc>
+        <w:tc>
+          <w:tcPr>
+            <w:tcW w:type="dxa" w:w="3168"/>
+            <w:vAlign w:val="center"/>
+            <w:tcMar>
+              <w:top w:w="100" w:type="dxa"/>
+              <w:bottom w:w="100" w:type="dxa"/>
+              <w:start w:w="100" w:type="dxa"/>
+              <w:end w:w="100" w:type="dxa"/>
+            </w:tcMar>
+          </w:tcPr>
+          <w:p>
+            <w:pPr>
+              <w:spacing w:after="0"/>
+            </w:pPr>
+            <w:r/>
+            <w:r>
+              <w:rPr>
+                <w:rFonts w:ascii="Calibri" w:hAnsi="Calibri"/>
+                <w:b w:val="0"/>
+                <w:sz w:val="17"/>
+              </w:rPr>
+              <w:t>Returns current iteration, dates, capacity metadata if available.</w:t>
+            </w:r>
+          </w:p>
+        </w:tc>
+      </w:tr>
+      <w:tr>
+        <w:tc>
+          <w:tcPr>
+            <w:tcW w:type="dxa" w:w="2232"/>
+            <w:vAlign w:val="center"/>
+            <w:tcMar>
+              <w:top w:w="100" w:type="dxa"/>
+              <w:bottom w:w="100" w:type="dxa"/>
+              <w:start w:w="100" w:type="dxa"/>
+              <w:end w:w="100" w:type="dxa"/>
+            </w:tcMar>
+          </w:tcPr>
+          <w:p>
+            <w:pPr>
+              <w:spacing w:after="0"/>
+            </w:pPr>
+            <w:r/>
+            <w:r>
+              <w:rPr>
+                <w:rFonts w:ascii="Calibri" w:hAnsi="Calibri"/>
+                <w:b w:val="0"/>
+                <w:sz w:val="17"/>
+              </w:rPr>
+              <w:t>Generate Plan</w:t>
+            </w:r>
+          </w:p>
+        </w:tc>
+        <w:tc>
+          <w:tcPr>
+            <w:tcW w:type="dxa" w:w="3816"/>
+            <w:vAlign w:val="center"/>
+            <w:tcMar>
+              <w:top w:w="100" w:type="dxa"/>
+              <w:bottom w:w="100" w:type="dxa"/>
+              <w:start w:w="100" w:type="dxa"/>
+              <w:end w:w="100" w:type="dxa"/>
+            </w:tcMar>
+          </w:tcPr>
+          <w:p>
+            <w:pPr>
+              <w:spacing w:after="0"/>
+            </w:pPr>
+            <w:r/>
+            <w:r>
+              <w:rPr>
+                <w:rFonts w:ascii="Calibri" w:hAnsi="Calibri"/>
+                <w:b w:val="0"/>
+                <w:sz w:val="17"/>
+              </w:rPr>
+              <w:t>POST /internal/devops/v1/implementation-plans</w:t>
+            </w:r>
+          </w:p>
+        </w:tc>
+        <w:tc>
+          <w:tcPr>
+            <w:tcW w:type="dxa" w:w="3168"/>
+            <w:vAlign w:val="center"/>
+            <w:tcMar>
+              <w:top w:w="100" w:type="dxa"/>
+              <w:bottom w:w="100" w:type="dxa"/>
+              <w:start w:w="100" w:type="dxa"/>
+              <w:end w:w="100" w:type="dxa"/>
+            </w:tcMar>
+          </w:tcPr>
+          <w:p>
+            <w:pPr>
+              <w:spacing w:after="0"/>
+            </w:pPr>
+            <w:r/>
+            <w:r>
+              <w:rPr>
+                <w:rFonts w:ascii="Calibri" w:hAnsi="Calibri"/>
+                <w:b w:val="0"/>
+                <w:sz w:val="17"/>
+              </w:rPr>
+              <w:t>Long-running workflow candidate; may return operationId.</w:t>
+            </w:r>
+          </w:p>
+        </w:tc>
+      </w:tr>
+    </w:tbl>
+    <w:p>
+      <w:pPr>
+        <w:spacing w:after="60"/>
+      </w:pPr>
     </w:p>
     <w:p>
       <w:pPr>
@@ -3577,7 +7015,7 @@
     </w:p>
     <w:p>
       <w:r>
-        <w:t>The SDKs are part of the architecture. They should provide shared platform primitives while avoiding hidden business logic. Existing SDKs should remain focused, and new AI/MCP SDKs should define contracts, manifests, actor context, and protocol helpers.</w:t>
+        <w:t>The SDKs are part of the architecture. In the proposed model, they provide shared platform primitives while avoiding hidden business logic. Existing SDKs remain focused, and new AI/MCP SDKs define contracts, manifests, actor context, and protocol helpers.</w:t>
       </w:r>
     </w:p>
     <w:tbl>
@@ -4051,7 +7489,7 @@
                 <w:b w:val="0"/>
                 <w:sz w:val="17"/>
               </w:rPr>
-              <w:t>afh-common-devops</w:t>
+              <w:t>No DevOps secrets SDK</w:t>
             </w:r>
           </w:p>
         </w:tc>
@@ -4077,7 +7515,7 @@
                 <w:b w:val="0"/>
                 <w:sz w:val="17"/>
               </w:rPr>
-              <w:t>Azure DevOps REST client primitives, work item DTOs, PR linking DTOs, retry and auth helpers.</w:t>
+              <w:t>DevOps auth, tokens, secrets, and workflow execution stay in afh-devops-integration-function-app. Optional shared contracts contain schemas only.</w:t>
             </w:r>
           </w:p>
         </w:tc>
@@ -4131,7 +7569,7 @@
                 <w:color w:val="12202F"/>
                 <w:sz w:val="20"/>
               </w:rPr>
-              <w:t>SDKs provide shared contracts and infrastructure primitives. They should not contain Booking, Calendar, Notification, Location, Adviser, Identity, ACS, Client, SharePoint, or DevOps workflow business logic.</w:t>
+              <w:t>SDKs provide shared contracts and infrastructure primitives. Domain and workflow business logic remains in the owning services rather than in SDK packages.</w:t>
             </w:r>
           </w:p>
         </w:tc>
@@ -4152,7 +7590,7 @@
     </w:p>
     <w:p>
       <w:r>
-        <w:t>AI actions should carry both the human principal and the AI principal. This allows AFH to answer who requested the work, which AI agent performed it, which service executed it, and which permission authorized it.</w:t>
+        <w:t>The proposed security model carries both the human principal and the AI principal. This allows AFH to answer who requested the work, which AI agent performed it, which service executed it, and which permission authorized it.</w:t>
       </w:r>
     </w:p>
     <w:tbl>
@@ -4220,7 +7658,7 @@
                 <w:color w:val="12202F"/>
                 <w:sz w:val="18"/>
               </w:rPr>
-              <w:t>Recommended approach</w:t>
+              <w:t>Proposed approach</w:t>
             </w:r>
           </w:p>
         </w:tc>
@@ -4328,7 +7766,7 @@
                 <w:b w:val="0"/>
                 <w:sz w:val="17"/>
               </w:rPr>
-              <w:t>Use capability-based permissions such as booking.read, booking.rearrange, notification.requeue, devops.workitem.write, and sharepoint.requirements.read.</w:t>
+              <w:t>Capability-based permissions such as booking.read, booking.rearrange, notification.requeue, devops.workitem.write, and sharepoint.requirements.read.</w:t>
             </w:r>
           </w:p>
         </w:tc>
@@ -4436,7 +7874,7 @@
                 <w:b w:val="0"/>
                 <w:sz w:val="17"/>
               </w:rPr>
-              <w:t>Every business service must re-authorize operations. The gateway is an enforcing boundary, not the only enforcement point.</w:t>
+              <w:t>Every business service re-authorizes operations. The gateway is an enforcing boundary, not the only enforcement point.</w:t>
             </w:r>
           </w:p>
         </w:tc>
@@ -4544,7 +7982,7 @@
                 <w:b w:val="0"/>
                 <w:sz w:val="17"/>
               </w:rPr>
-              <w:t>Require dry-run, approval, idempotency keys, and stronger audit for destructive or mutating operations.</w:t>
+              <w:t>Dry-run, approval, idempotency keys, and stronger audit for destructive or mutating operations.</w:t>
             </w:r>
           </w:p>
         </w:tc>
@@ -4565,7 +8003,7 @@
     </w:p>
     <w:p>
       <w:r>
-        <w:t>Each service should publish an internal AI tool manifest. The MCP Gateway should discover manifests from configured service providers, cache them, validate them, and register tools dynamically.</w:t>
+        <w:t>Each service publishes an internal AI tool manifest in the proposed model. The MCP Gateway discovers manifests from configured service providers, caches them, validates them, and registers tools dynamically.</w:t>
       </w:r>
     </w:p>
     <w:tbl>
@@ -5086,7 +8524,7 @@
     </w:p>
     <w:p>
       <w:r>
-        <w:t>At 30 or more services, the gateway must remain a routing and governance layer. Service-owned manifests, SDK contracts, and workflow services prevent it from becoming a bottleneck or God Service.</w:t>
+        <w:t>At 30 or more services, the gateway is intended to remain a routing and governance layer. Service-owned manifests, SDK contracts, and workflow services prevent it from becoming a bottleneck or God Service.</w:t>
       </w:r>
     </w:p>
     <w:p>
@@ -5095,7 +8533,7 @@
         <w:spacing w:after="80"/>
       </w:pPr>
       <w:r>
-        <w:t>Start with read-only tools and explicit manifests for Booking, Calendar, Notification, Location, Adviser, Identity, ACS, and Client Integration.</w:t>
+        <w:t>Initial scope focuses on read-only tools and explicit manifests for Booking, Calendar, Notification, Location, Adviser, Identity, ACS, and Client Integration.</w:t>
       </w:r>
     </w:p>
     <w:p>
@@ -5104,7 +8542,7 @@
         <w:spacing w:after="80"/>
       </w:pPr>
       <w:r>
-        <w:t>Add mutating tools only after identity propagation, downstream authorization, audit logging, dry-run, and approval flows are in place.</w:t>
+        <w:t>Mutating tools follow after identity propagation, downstream authorization, audit logging, dry-run, and approval flows are in place.</w:t>
       </w:r>
     </w:p>
     <w:p>
@@ -5113,7 +8551,7 @@
         <w:spacing w:after="80"/>
       </w:pPr>
       <w:r>
-        <w:t>Create DevOps Integration as the first workflow-specific service.</w:t>
+        <w:t>DevOps Integration is proposed as the first workflow-specific service.</w:t>
       </w:r>
     </w:p>
     <w:p>
@@ -5122,7 +8560,7 @@
         <w:spacing w:after="80"/>
       </w:pPr>
       <w:r>
-        <w:t>Add SharePoint or Document Intelligence as a separate service when requirement analysis grows beyond simple document retrieval.</w:t>
+        <w:t>SharePoint or Document Intelligence becomes a separate service when requirement analysis grows beyond simple document retrieval.</w:t>
       </w:r>
     </w:p>
     <w:p>
@@ -5131,7 +8569,7 @@
         <w:spacing w:after="80"/>
       </w:pPr>
       <w:r>
-        <w:t>Split the gateway into separate business, DevOps, and operations MCP gateways only if isolation, scaling, or risk justifies it.</w:t>
+        <w:t>Separate business, DevOps, and operations MCP gateways remain an option if isolation, scaling, or risk justifies it.</w:t>
       </w:r>
     </w:p>
     <w:p>
@@ -5193,7 +8631,7 @@
         <w:br/>
         <w:t xml:space="preserve">  /afh-common-mcp</w:t>
         <w:br/>
-        <w:t xml:space="preserve">  /afh-common-devops</w:t>
+        <w:t xml:space="preserve">  # Optional only if needed: contract-only DevOps DTO package with no secrets or auth clients</w:t>
         <w:br/>
       </w:r>
     </w:p>
@@ -5238,7 +8676,7 @@
                 <w:color w:val="1F4D78"/>
                 <w:sz w:val="21"/>
               </w:rPr>
-              <w:t>Decision</w:t>
+              <w:t>Proposal statement</w:t>
             </w:r>
             <w:r>
               <w:br/>
@@ -5248,7 +8686,7 @@
                 <w:color w:val="12202F"/>
                 <w:sz w:val="20"/>
               </w:rPr>
-              <w:t>Proceed with a central AFH MCP Gateway that discovers service-owned tool providers. Add a DevOps Integration Service for Azure DevOps workflows. Use SDKs for shared AI/MCP/DevOps contracts and infrastructure primitives. Keep business rules in the owning services.</w:t>
+              <w:t>The proposal is to introduce a central AFH MCP Gateway that discovers service-owned tool providers, add a DevOps Integration Function App for Azure DevOps workflows and secrets, and use SDKs only for shared AI/MCP contracts and infrastructure primitives while keeping business rules in the owning services.</w:t>
             </w:r>
           </w:p>
         </w:tc>

</xml_diff>